<commit_message>
updated manuscript and forms
</commit_message>
<xml_diff>
--- a/writing/submissions/PLOS medicine/national_po_PLOS_medicine_apr_9.docx
+++ b/writing/submissions/PLOS medicine/national_po_PLOS_medicine_apr_9.docx
@@ -5357,7 +5357,25 @@
           <w:sz w:val="20"/>
           <w:szCs w:val="20"/>
         </w:rPr>
-        <w:t xml:space="preserve">a proxy for cyclones, tornadoes, and other storms). These factors influence both power outage and hospitalization rates. We used daily county-level maximal temperature, average wind speed, and total precipitation measures from gridMET, a dataset of daily high-spatial resolution surface meteorological data </w:t>
+        <w:t xml:space="preserve">a proxy for cyclones, tornadoes, and other storms). These factors influence both power outage and hospitalization rates. We used daily county-level maximal temperature, average wind speed, and total precipitation measures from </w:t>
+      </w:r>
+      <w:proofErr w:type="spellStart"/>
+      <w:r>
+        <w:rPr>
+          <w:rFonts w:ascii="Arial" w:hAnsi="Arial" w:cs="Arial"/>
+          <w:sz w:val="20"/>
+          <w:szCs w:val="20"/>
+        </w:rPr>
+        <w:t>gridMET</w:t>
+      </w:r>
+      <w:proofErr w:type="spellEnd"/>
+      <w:r>
+        <w:rPr>
+          <w:rFonts w:ascii="Arial" w:hAnsi="Arial" w:cs="Arial"/>
+          <w:sz w:val="20"/>
+          <w:szCs w:val="20"/>
+        </w:rPr>
+        <w:t xml:space="preserve">, a dataset of daily high-spatial resolution surface meteorological data </w:t>
       </w:r>
       <w:r>
         <w:rPr>
@@ -5599,7 +5617,25 @@
           <w:sz w:val="20"/>
           <w:szCs w:val="20"/>
         </w:rPr>
-        <w:t xml:space="preserve"> and CVD and respiratory hospitalization rates separately. We ran several test models with splines on precipitation and wind speed with varying degrees of flexibility (linear and 2-4 degrees of freedom) and tested model fit using the quasi-Akaike Information Criterion (qAIC). We controlled for these confounders in our </w:t>
+        <w:t xml:space="preserve"> and CVD and respiratory hospitalization rates separately. We ran several test models with splines on precipitation and wind speed with varying degrees of flexibility (linear and 2-4 degrees of freedom) and tested model fit using the quasi-Akaike Information Criterion (</w:t>
+      </w:r>
+      <w:proofErr w:type="spellStart"/>
+      <w:r>
+        <w:rPr>
+          <w:rFonts w:ascii="Arial" w:hAnsi="Arial" w:cs="Arial"/>
+          <w:sz w:val="20"/>
+          <w:szCs w:val="20"/>
+        </w:rPr>
+        <w:t>qAIC</w:t>
+      </w:r>
+      <w:proofErr w:type="spellEnd"/>
+      <w:r>
+        <w:rPr>
+          <w:rFonts w:ascii="Arial" w:hAnsi="Arial" w:cs="Arial"/>
+          <w:sz w:val="20"/>
+          <w:szCs w:val="20"/>
+        </w:rPr>
+        <w:t xml:space="preserve">). We controlled for these confounders in our </w:t>
       </w:r>
       <w:r>
         <w:rPr>
@@ -5608,7 +5644,25 @@
           <w:szCs w:val="20"/>
         </w:rPr>
         <w:lastRenderedPageBreak/>
-        <w:t xml:space="preserve">analytic power outage models with the qAIC-determined degree of flexibility. In respiratory hospitalization models, we controlled for </w:t>
+        <w:t xml:space="preserve">analytic power outage models with the </w:t>
+      </w:r>
+      <w:proofErr w:type="spellStart"/>
+      <w:r>
+        <w:rPr>
+          <w:rFonts w:ascii="Arial" w:hAnsi="Arial" w:cs="Arial"/>
+          <w:sz w:val="20"/>
+          <w:szCs w:val="20"/>
+        </w:rPr>
+        <w:t>qAIC</w:t>
+      </w:r>
+      <w:proofErr w:type="spellEnd"/>
+      <w:r>
+        <w:rPr>
+          <w:rFonts w:ascii="Arial" w:hAnsi="Arial" w:cs="Arial"/>
+          <w:sz w:val="20"/>
+          <w:szCs w:val="20"/>
+        </w:rPr>
+        <w:t xml:space="preserve">-determined degree of flexibility. In respiratory hospitalization models, we controlled for </w:t>
       </w:r>
       <w:r>
         <w:rPr>
@@ -5893,7 +5947,25 @@
           <w:sz w:val="20"/>
           <w:szCs w:val="20"/>
         </w:rPr>
-        <w:t>. We tested 3-5 degrees of freedom on the lag dimension (1-3 knots), and we compared model fit using qAICs. We found that for CVD outcomes, 5 degrees of freedom across the lag dimension produced the best model fit, and for respiratory hospitalizations, 3 degrees of freedom resulted in the best model fit.</w:t>
+        <w:t xml:space="preserve">. We tested 3-5 degrees of freedom on the lag dimension (1-3 knots), and we compared model fit using </w:t>
+      </w:r>
+      <w:proofErr w:type="spellStart"/>
+      <w:r>
+        <w:rPr>
+          <w:rFonts w:ascii="Arial" w:hAnsi="Arial" w:cs="Arial"/>
+          <w:sz w:val="20"/>
+          <w:szCs w:val="20"/>
+        </w:rPr>
+        <w:t>qAICs</w:t>
+      </w:r>
+      <w:proofErr w:type="spellEnd"/>
+      <w:r>
+        <w:rPr>
+          <w:rFonts w:ascii="Arial" w:hAnsi="Arial" w:cs="Arial"/>
+          <w:sz w:val="20"/>
+          <w:szCs w:val="20"/>
+        </w:rPr>
+        <w:t>. We found that for CVD outcomes, 5 degrees of freedom across the lag dimension produced the best model fit, and for respiratory hospitalizations, 3 degrees of freedom resulted in the best model fit.</w:t>
       </w:r>
     </w:p>
     <w:p>
@@ -6011,7 +6083,25 @@
           <w:sz w:val="20"/>
           <w:szCs w:val="20"/>
         </w:rPr>
-        <w:t xml:space="preserve"> used qAICs to find the best-fitting model among these eight model options.</w:t>
+        <w:t xml:space="preserve"> used </w:t>
+      </w:r>
+      <w:proofErr w:type="spellStart"/>
+      <w:r>
+        <w:rPr>
+          <w:rFonts w:ascii="Arial" w:hAnsi="Arial" w:cs="Arial"/>
+          <w:sz w:val="20"/>
+          <w:szCs w:val="20"/>
+        </w:rPr>
+        <w:t>qAICs</w:t>
+      </w:r>
+      <w:proofErr w:type="spellEnd"/>
+      <w:r>
+        <w:rPr>
+          <w:rFonts w:ascii="Arial" w:hAnsi="Arial" w:cs="Arial"/>
+          <w:sz w:val="20"/>
+          <w:szCs w:val="20"/>
+        </w:rPr>
+        <w:t xml:space="preserve"> to find the best-fitting model among these eight model options.</w:t>
       </w:r>
     </w:p>
     <w:p>
@@ -6258,7 +6348,25 @@
           <w:sz w:val="20"/>
           <w:szCs w:val="20"/>
         </w:rPr>
-        <w:t xml:space="preserve">. We estimated DME use with emPOWER data </w:t>
+        <w:t xml:space="preserve">. We estimated DME use with </w:t>
+      </w:r>
+      <w:proofErr w:type="spellStart"/>
+      <w:r>
+        <w:rPr>
+          <w:rFonts w:ascii="Arial" w:hAnsi="Arial" w:cs="Arial"/>
+          <w:sz w:val="20"/>
+          <w:szCs w:val="20"/>
+        </w:rPr>
+        <w:t>emPOWER</w:t>
+      </w:r>
+      <w:proofErr w:type="spellEnd"/>
+      <w:r>
+        <w:rPr>
+          <w:rFonts w:ascii="Arial" w:hAnsi="Arial" w:cs="Arial"/>
+          <w:sz w:val="20"/>
+          <w:szCs w:val="20"/>
+        </w:rPr>
+        <w:t xml:space="preserve"> data </w:t>
       </w:r>
       <w:r>
         <w:rPr>
@@ -6355,6 +6463,7 @@
         </w:rPr>
         <w:t xml:space="preserve">We conducted analyses in R 4.4.1, using R packages </w:t>
       </w:r>
+      <w:proofErr w:type="spellStart"/>
       <w:r>
         <w:rPr>
           <w:rFonts w:ascii="Arial" w:hAnsi="Arial" w:cs="Arial"/>
@@ -6365,6 +6474,7 @@
         </w:rPr>
         <w:t>gnm</w:t>
       </w:r>
+      <w:proofErr w:type="spellEnd"/>
       <w:r>
         <w:rPr>
           <w:rFonts w:ascii="Arial" w:hAnsi="Arial" w:cs="Arial"/>
@@ -6505,6 +6615,7 @@
         </w:rPr>
         <w:t xml:space="preserve">, and </w:t>
       </w:r>
+      <w:proofErr w:type="spellStart"/>
       <w:r>
         <w:rPr>
           <w:rFonts w:ascii="Arial" w:hAnsi="Arial" w:cs="Arial"/>
@@ -6515,6 +6626,7 @@
         </w:rPr>
         <w:t>dlnm</w:t>
       </w:r>
+      <w:proofErr w:type="spellEnd"/>
       <w:r>
         <w:rPr>
           <w:rFonts w:ascii="Arial" w:hAnsi="Arial" w:cs="Arial"/>
@@ -9798,7 +9910,25 @@
           <w:sz w:val="20"/>
           <w:szCs w:val="20"/>
         </w:rPr>
-        <w:t xml:space="preserve">n. In our main analysis, we assessed exposure to 8+ hour power outages, and we conducted sensitivity analyses evaluating 4+ and 12+ hour outages, finding that longer outage durations were associated with higher hospitalization rates. We also modelled the relationship between the county-level number of hours without power and hospitalization rates, and tested for non-linearity that would indicate a threshold effect, i.e. an inflection point where outages longer than a certain duration started impacting hospitalization risk. We did not find evidence for a threshold. We found that even one-hour outages were associated with increased cardiovascular and respiratory hospitalizations, suggesting that even short outages can have substantial population health impacts, especially since shorter outages are much more prevalent. </w:t>
+        <w:t xml:space="preserve">n. In our main analysis, we assessed exposure to 8+ hour power outages, and we conducted sensitivity analyses evaluating 4+ and 12+ hour outages, finding that longer outage durations were associated with higher hospitalization rates. We also modelled the relationship between the county-level number of hours without power and hospitalization rates, and tested for non-linearity that would indicate a threshold effect, i.e. an inflection </w:t>
+      </w:r>
+      <w:proofErr w:type="gramStart"/>
+      <w:r>
+        <w:rPr>
+          <w:rFonts w:ascii="Arial" w:hAnsi="Arial" w:cs="Arial"/>
+          <w:sz w:val="20"/>
+          <w:szCs w:val="20"/>
+        </w:rPr>
+        <w:t>point</w:t>
+      </w:r>
+      <w:proofErr w:type="gramEnd"/>
+      <w:r>
+        <w:rPr>
+          <w:rFonts w:ascii="Arial" w:hAnsi="Arial" w:cs="Arial"/>
+          <w:sz w:val="20"/>
+          <w:szCs w:val="20"/>
+        </w:rPr>
+        <w:t xml:space="preserve"> where outages longer than a certain duration started impacting hospitalization risk. We did not find evidence for a threshold. We found that even one-hour outages were associated with increased cardiovascular and respiratory hospitalizations, suggesting that even short outages can have substantial population health impacts, especially since shorter outages are much more prevalent. </w:t>
       </w:r>
     </w:p>
     <w:p>
@@ -11636,6 +11766,9 @@
     <w:p>
       <w:pPr>
         <w:pStyle w:val="Bibliography"/>
+        <w:rPr>
+          <w:rFonts w:ascii="Arial" w:hAnsi="Arial" w:cs="Arial"/>
+        </w:rPr>
       </w:pPr>
       <w:r>
         <w:rPr>
@@ -11662,9 +11795,15 @@
         <w:fldChar w:fldCharType="separate"/>
       </w:r>
       <w:r>
+        <w:rPr>
+          <w:rFonts w:ascii="Arial" w:hAnsi="Arial" w:cs="Arial"/>
+        </w:rPr>
         <w:t xml:space="preserve">1. </w:t>
       </w:r>
       <w:r>
+        <w:rPr>
+          <w:rFonts w:ascii="Arial" w:hAnsi="Arial" w:cs="Arial"/>
+        </w:rPr>
         <w:tab/>
         <w:t>Climate Central, Weather-related Power Outages Rising. (2024). Available at: https://www.climatecentral.org/climate-matters/weather-related-power-outages-rising [Accessed 5 December 2024].</w:t>
       </w:r>
@@ -11672,11 +11811,20 @@
     <w:p>
       <w:pPr>
         <w:pStyle w:val="Bibliography"/>
-      </w:pPr>
-      <w:r>
+        <w:rPr>
+          <w:rFonts w:ascii="Arial" w:hAnsi="Arial" w:cs="Arial"/>
+        </w:rPr>
+      </w:pPr>
+      <w:r>
+        <w:rPr>
+          <w:rFonts w:ascii="Arial" w:hAnsi="Arial" w:cs="Arial"/>
+        </w:rPr>
         <w:t xml:space="preserve">2. </w:t>
       </w:r>
       <w:r>
+        <w:rPr>
+          <w:rFonts w:ascii="Arial" w:hAnsi="Arial" w:cs="Arial"/>
+        </w:rPr>
         <w:tab/>
         <w:t>U.S. Energy Information Administration, U.S. electricity customers experienced eight hours of power interruptions in 2020. (2021). Available at: https://www.eia.gov/todayinenergy/detail.php?id=50316# [Accessed 5 December 2024].</w:t>
       </w:r>
@@ -11684,43 +11832,69 @@
     <w:p>
       <w:pPr>
         <w:pStyle w:val="Bibliography"/>
-      </w:pPr>
-      <w:r>
+        <w:rPr>
+          <w:rFonts w:ascii="Arial" w:hAnsi="Arial" w:cs="Arial"/>
+        </w:rPr>
+      </w:pPr>
+      <w:r>
+        <w:rPr>
+          <w:rFonts w:ascii="Arial" w:hAnsi="Arial" w:cs="Arial"/>
+        </w:rPr>
         <w:t xml:space="preserve">3. </w:t>
       </w:r>
       <w:r>
+        <w:rPr>
+          <w:rFonts w:ascii="Arial" w:hAnsi="Arial" w:cs="Arial"/>
+        </w:rPr>
         <w:tab/>
         <w:t xml:space="preserve">J. A. Casey, M. Fukurai, D. Hernández, S. Balsari, M. V. Kiang, Power Outages and Community Health: a Narrative Review. </w:t>
       </w:r>
       <w:r>
         <w:rPr>
+          <w:rFonts w:ascii="Arial" w:hAnsi="Arial" w:cs="Arial"/>
           <w:i/>
           <w:iCs/>
         </w:rPr>
         <w:t>Curr Envir Health Rpt</w:t>
       </w:r>
       <w:r>
+        <w:rPr>
+          <w:rFonts w:ascii="Arial" w:hAnsi="Arial" w:cs="Arial"/>
+        </w:rPr>
         <w:t xml:space="preserve"> </w:t>
       </w:r>
       <w:r>
         <w:rPr>
+          <w:rFonts w:ascii="Arial" w:hAnsi="Arial" w:cs="Arial"/>
           <w:b/>
           <w:bCs/>
         </w:rPr>
         <w:t>7</w:t>
       </w:r>
       <w:r>
+        <w:rPr>
+          <w:rFonts w:ascii="Arial" w:hAnsi="Arial" w:cs="Arial"/>
+        </w:rPr>
         <w:t>, 371–383 (2020).</w:t>
       </w:r>
     </w:p>
     <w:p>
       <w:pPr>
         <w:pStyle w:val="Bibliography"/>
-      </w:pPr>
-      <w:r>
+        <w:rPr>
+          <w:rFonts w:ascii="Arial" w:hAnsi="Arial" w:cs="Arial"/>
+        </w:rPr>
+      </w:pPr>
+      <w:r>
+        <w:rPr>
+          <w:rFonts w:ascii="Arial" w:hAnsi="Arial" w:cs="Arial"/>
+        </w:rPr>
         <w:t xml:space="preserve">4. </w:t>
       </w:r>
       <w:r>
+        <w:rPr>
+          <w:rFonts w:ascii="Arial" w:hAnsi="Arial" w:cs="Arial"/>
+        </w:rPr>
         <w:tab/>
         <w:t>The US has more power outages than any other developed country. Here’s why. (2020). Available at: https://www.popsci.com/story/environment/why-us-lose-power-storms/ [Accessed 5 December 2024].</w:t>
       </w:r>
@@ -11728,53 +11902,83 @@
     <w:p>
       <w:pPr>
         <w:pStyle w:val="Bibliography"/>
-      </w:pPr>
-      <w:r>
+        <w:rPr>
+          <w:rFonts w:ascii="Arial" w:hAnsi="Arial" w:cs="Arial"/>
+        </w:rPr>
+      </w:pPr>
+      <w:r>
+        <w:rPr>
+          <w:rFonts w:ascii="Arial" w:hAnsi="Arial" w:cs="Arial"/>
+        </w:rPr>
         <w:t xml:space="preserve">5. </w:t>
       </w:r>
       <w:r>
+        <w:rPr>
+          <w:rFonts w:ascii="Arial" w:hAnsi="Arial" w:cs="Arial"/>
+        </w:rPr>
         <w:tab/>
         <w:t xml:space="preserve">V. Do, </w:t>
       </w:r>
       <w:r>
         <w:rPr>
+          <w:rFonts w:ascii="Arial" w:hAnsi="Arial" w:cs="Arial"/>
           <w:i/>
           <w:iCs/>
         </w:rPr>
         <w:t>et al.</w:t>
       </w:r>
       <w:r>
+        <w:rPr>
+          <w:rFonts w:ascii="Arial" w:hAnsi="Arial" w:cs="Arial"/>
+        </w:rPr>
         <w:t xml:space="preserve">, Spatiotemporal distribution of power outages with climate events and social vulnerability in the USA. </w:t>
       </w:r>
       <w:r>
         <w:rPr>
+          <w:rFonts w:ascii="Arial" w:hAnsi="Arial" w:cs="Arial"/>
           <w:i/>
           <w:iCs/>
         </w:rPr>
         <w:t>Nat Commun</w:t>
       </w:r>
       <w:r>
+        <w:rPr>
+          <w:rFonts w:ascii="Arial" w:hAnsi="Arial" w:cs="Arial"/>
+        </w:rPr>
         <w:t xml:space="preserve"> </w:t>
       </w:r>
       <w:r>
         <w:rPr>
+          <w:rFonts w:ascii="Arial" w:hAnsi="Arial" w:cs="Arial"/>
           <w:b/>
           <w:bCs/>
         </w:rPr>
         <w:t>14</w:t>
       </w:r>
       <w:r>
+        <w:rPr>
+          <w:rFonts w:ascii="Arial" w:hAnsi="Arial" w:cs="Arial"/>
+        </w:rPr>
         <w:t>, 2470 (2023).</w:t>
       </w:r>
     </w:p>
     <w:p>
       <w:pPr>
         <w:pStyle w:val="Bibliography"/>
-      </w:pPr>
-      <w:r>
+        <w:rPr>
+          <w:rFonts w:ascii="Arial" w:hAnsi="Arial" w:cs="Arial"/>
+        </w:rPr>
+      </w:pPr>
+      <w:r>
+        <w:rPr>
+          <w:rFonts w:ascii="Arial" w:hAnsi="Arial" w:cs="Arial"/>
+        </w:rPr>
         <w:t xml:space="preserve">6. </w:t>
       </w:r>
       <w:r>
+        <w:rPr>
+          <w:rFonts w:ascii="Arial" w:hAnsi="Arial" w:cs="Arial"/>
+        </w:rPr>
         <w:tab/>
         <w:t>United States Environmental Protection Agency, Climate Change Impacts on Energy. Available at: https://www.epa.gov/climateimpacts/climate-change-impacts-energy.</w:t>
       </w:r>
@@ -11782,11 +11986,20 @@
     <w:p>
       <w:pPr>
         <w:pStyle w:val="Bibliography"/>
-      </w:pPr>
-      <w:r>
+        <w:rPr>
+          <w:rFonts w:ascii="Arial" w:hAnsi="Arial" w:cs="Arial"/>
+        </w:rPr>
+      </w:pPr>
+      <w:r>
+        <w:rPr>
+          <w:rFonts w:ascii="Arial" w:hAnsi="Arial" w:cs="Arial"/>
+        </w:rPr>
         <w:t xml:space="preserve">7. </w:t>
       </w:r>
       <w:r>
+        <w:rPr>
+          <w:rFonts w:ascii="Arial" w:hAnsi="Arial" w:cs="Arial"/>
+        </w:rPr>
         <w:tab/>
         <w:t>Washington Post, Nation at risk of winter blackouts as power grid remains under strain. Available at: https://www.washingtonpost.com/business/2023/11/08/power-grid-blackouts-texas/.</w:t>
       </w:r>
@@ -11794,552 +12007,840 @@
     <w:p>
       <w:pPr>
         <w:pStyle w:val="Bibliography"/>
-      </w:pPr>
-      <w:r>
+        <w:rPr>
+          <w:rFonts w:ascii="Arial" w:hAnsi="Arial" w:cs="Arial"/>
+        </w:rPr>
+      </w:pPr>
+      <w:r>
+        <w:rPr>
+          <w:rFonts w:ascii="Arial" w:hAnsi="Arial" w:cs="Arial"/>
+        </w:rPr>
         <w:t xml:space="preserve">8. </w:t>
       </w:r>
       <w:r>
+        <w:rPr>
+          <w:rFonts w:ascii="Arial" w:hAnsi="Arial" w:cs="Arial"/>
+        </w:rPr>
         <w:tab/>
         <w:t xml:space="preserve">M. Mango, J. A. Casey, D. Hernández, Resilient Power: A home-based electricity generation and storage solution for the medically vulnerable during climate-induced power outages. </w:t>
       </w:r>
       <w:r>
         <w:rPr>
+          <w:rFonts w:ascii="Arial" w:hAnsi="Arial" w:cs="Arial"/>
           <w:i/>
           <w:iCs/>
         </w:rPr>
         <w:t>Futures</w:t>
       </w:r>
       <w:r>
+        <w:rPr>
+          <w:rFonts w:ascii="Arial" w:hAnsi="Arial" w:cs="Arial"/>
+        </w:rPr>
         <w:t xml:space="preserve"> </w:t>
       </w:r>
       <w:r>
         <w:rPr>
+          <w:rFonts w:ascii="Arial" w:hAnsi="Arial" w:cs="Arial"/>
           <w:b/>
           <w:bCs/>
         </w:rPr>
         <w:t>128</w:t>
       </w:r>
       <w:r>
+        <w:rPr>
+          <w:rFonts w:ascii="Arial" w:hAnsi="Arial" w:cs="Arial"/>
+        </w:rPr>
         <w:t>, 102707 (2021).</w:t>
       </w:r>
     </w:p>
     <w:p>
       <w:pPr>
         <w:pStyle w:val="Bibliography"/>
-      </w:pPr>
-      <w:r>
+        <w:rPr>
+          <w:rFonts w:ascii="Arial" w:hAnsi="Arial" w:cs="Arial"/>
+        </w:rPr>
+      </w:pPr>
+      <w:r>
+        <w:rPr>
+          <w:rFonts w:ascii="Arial" w:hAnsi="Arial" w:cs="Arial"/>
+        </w:rPr>
         <w:t xml:space="preserve">9. </w:t>
       </w:r>
       <w:r>
+        <w:rPr>
+          <w:rFonts w:ascii="Arial" w:hAnsi="Arial" w:cs="Arial"/>
+        </w:rPr>
         <w:tab/>
         <w:t xml:space="preserve">B. Stone, </w:t>
       </w:r>
       <w:r>
         <w:rPr>
+          <w:rFonts w:ascii="Arial" w:hAnsi="Arial" w:cs="Arial"/>
           <w:i/>
           <w:iCs/>
         </w:rPr>
         <w:t>et al.</w:t>
       </w:r>
       <w:r>
+        <w:rPr>
+          <w:rFonts w:ascii="Arial" w:hAnsi="Arial" w:cs="Arial"/>
+        </w:rPr>
         <w:t xml:space="preserve">, Compound Climate and Infrastructure Events: How Electrical Grid Failure Alters Heat Wave Risk. </w:t>
       </w:r>
       <w:r>
         <w:rPr>
+          <w:rFonts w:ascii="Arial" w:hAnsi="Arial" w:cs="Arial"/>
           <w:i/>
           <w:iCs/>
         </w:rPr>
         <w:t>Environ. Sci. Technol.</w:t>
       </w:r>
       <w:r>
+        <w:rPr>
+          <w:rFonts w:ascii="Arial" w:hAnsi="Arial" w:cs="Arial"/>
+        </w:rPr>
         <w:t xml:space="preserve"> </w:t>
       </w:r>
       <w:r>
         <w:rPr>
+          <w:rFonts w:ascii="Arial" w:hAnsi="Arial" w:cs="Arial"/>
           <w:b/>
           <w:bCs/>
         </w:rPr>
         <w:t>55</w:t>
       </w:r>
       <w:r>
+        <w:rPr>
+          <w:rFonts w:ascii="Arial" w:hAnsi="Arial" w:cs="Arial"/>
+        </w:rPr>
         <w:t>, 6957–6964 (2021).</w:t>
       </w:r>
     </w:p>
     <w:p>
       <w:pPr>
         <w:pStyle w:val="Bibliography"/>
-      </w:pPr>
-      <w:r>
+        <w:rPr>
+          <w:rFonts w:ascii="Arial" w:hAnsi="Arial" w:cs="Arial"/>
+        </w:rPr>
+      </w:pPr>
+      <w:r>
+        <w:rPr>
+          <w:rFonts w:ascii="Arial" w:hAnsi="Arial" w:cs="Arial"/>
+        </w:rPr>
         <w:t xml:space="preserve">10. </w:t>
       </w:r>
       <w:r>
+        <w:rPr>
+          <w:rFonts w:ascii="Arial" w:hAnsi="Arial" w:cs="Arial"/>
+        </w:rPr>
         <w:tab/>
         <w:t xml:space="preserve">A. R. Nunes, General and specified vulnerability to extreme temperatures among older adults. </w:t>
       </w:r>
       <w:r>
         <w:rPr>
+          <w:rFonts w:ascii="Arial" w:hAnsi="Arial" w:cs="Arial"/>
           <w:i/>
           <w:iCs/>
         </w:rPr>
         <w:t>International Journal of Environmental Health Research</w:t>
       </w:r>
       <w:r>
+        <w:rPr>
+          <w:rFonts w:ascii="Arial" w:hAnsi="Arial" w:cs="Arial"/>
+        </w:rPr>
         <w:t xml:space="preserve"> </w:t>
       </w:r>
       <w:r>
         <w:rPr>
+          <w:rFonts w:ascii="Arial" w:hAnsi="Arial" w:cs="Arial"/>
           <w:b/>
           <w:bCs/>
         </w:rPr>
         <w:t>30</w:t>
       </w:r>
       <w:r>
+        <w:rPr>
+          <w:rFonts w:ascii="Arial" w:hAnsi="Arial" w:cs="Arial"/>
+        </w:rPr>
         <w:t>, 515–532 (2020).</w:t>
       </w:r>
     </w:p>
     <w:p>
       <w:pPr>
         <w:pStyle w:val="Bibliography"/>
-      </w:pPr>
-      <w:r>
+        <w:rPr>
+          <w:rFonts w:ascii="Arial" w:hAnsi="Arial" w:cs="Arial"/>
+        </w:rPr>
+      </w:pPr>
+      <w:r>
+        <w:rPr>
+          <w:rFonts w:ascii="Arial" w:hAnsi="Arial" w:cs="Arial"/>
+        </w:rPr>
         <w:t xml:space="preserve">11. </w:t>
       </w:r>
       <w:r>
+        <w:rPr>
+          <w:rFonts w:ascii="Arial" w:hAnsi="Arial" w:cs="Arial"/>
+        </w:rPr>
         <w:tab/>
         <w:t xml:space="preserve">T. Benmarhnia, S. Deguen, J. S. Kaufman, A. Smargiassi, Review Article: Vulnerability to Heat-related Mortality. </w:t>
       </w:r>
       <w:r>
         <w:rPr>
+          <w:rFonts w:ascii="Arial" w:hAnsi="Arial" w:cs="Arial"/>
           <w:i/>
           <w:iCs/>
         </w:rPr>
         <w:t>Epidemiology</w:t>
       </w:r>
       <w:r>
+        <w:rPr>
+          <w:rFonts w:ascii="Arial" w:hAnsi="Arial" w:cs="Arial"/>
+        </w:rPr>
         <w:t xml:space="preserve"> </w:t>
       </w:r>
       <w:r>
         <w:rPr>
+          <w:rFonts w:ascii="Arial" w:hAnsi="Arial" w:cs="Arial"/>
           <w:b/>
           <w:bCs/>
         </w:rPr>
         <w:t>26</w:t>
       </w:r>
       <w:r>
+        <w:rPr>
+          <w:rFonts w:ascii="Arial" w:hAnsi="Arial" w:cs="Arial"/>
+        </w:rPr>
         <w:t>, 781–793 (2015).</w:t>
       </w:r>
     </w:p>
     <w:p>
       <w:pPr>
         <w:pStyle w:val="Bibliography"/>
-      </w:pPr>
-      <w:r>
+        <w:rPr>
+          <w:rFonts w:ascii="Arial" w:hAnsi="Arial" w:cs="Arial"/>
+        </w:rPr>
+      </w:pPr>
+      <w:r>
+        <w:rPr>
+          <w:rFonts w:ascii="Arial" w:hAnsi="Arial" w:cs="Arial"/>
+        </w:rPr>
         <w:lastRenderedPageBreak/>
         <w:t xml:space="preserve">12. </w:t>
       </w:r>
       <w:r>
+        <w:rPr>
+          <w:rFonts w:ascii="Arial" w:hAnsi="Arial" w:cs="Arial"/>
+        </w:rPr>
         <w:tab/>
         <w:t xml:space="preserve">R. D. Meade, </w:t>
       </w:r>
       <w:r>
         <w:rPr>
+          <w:rFonts w:ascii="Arial" w:hAnsi="Arial" w:cs="Arial"/>
           <w:i/>
           <w:iCs/>
         </w:rPr>
         <w:t>et al.</w:t>
       </w:r>
       <w:r>
+        <w:rPr>
+          <w:rFonts w:ascii="Arial" w:hAnsi="Arial" w:cs="Arial"/>
+        </w:rPr>
         <w:t xml:space="preserve">, Physiological factors characterizing heat-vulnerable older adults: A narrative review. </w:t>
       </w:r>
       <w:r>
         <w:rPr>
+          <w:rFonts w:ascii="Arial" w:hAnsi="Arial" w:cs="Arial"/>
           <w:i/>
           <w:iCs/>
         </w:rPr>
         <w:t>Environment International</w:t>
       </w:r>
       <w:r>
+        <w:rPr>
+          <w:rFonts w:ascii="Arial" w:hAnsi="Arial" w:cs="Arial"/>
+        </w:rPr>
         <w:t xml:space="preserve"> </w:t>
       </w:r>
       <w:r>
         <w:rPr>
+          <w:rFonts w:ascii="Arial" w:hAnsi="Arial" w:cs="Arial"/>
           <w:b/>
           <w:bCs/>
         </w:rPr>
         <w:t>144</w:t>
       </w:r>
       <w:r>
+        <w:rPr>
+          <w:rFonts w:ascii="Arial" w:hAnsi="Arial" w:cs="Arial"/>
+        </w:rPr>
         <w:t>, 105909 (2020).</w:t>
       </w:r>
     </w:p>
     <w:p>
       <w:pPr>
         <w:pStyle w:val="Bibliography"/>
-      </w:pPr>
-      <w:r>
+        <w:rPr>
+          <w:rFonts w:ascii="Arial" w:hAnsi="Arial" w:cs="Arial"/>
+        </w:rPr>
+      </w:pPr>
+      <w:r>
+        <w:rPr>
+          <w:rFonts w:ascii="Arial" w:hAnsi="Arial" w:cs="Arial"/>
+        </w:rPr>
         <w:t xml:space="preserve">13. </w:t>
       </w:r>
       <w:r>
+        <w:rPr>
+          <w:rFonts w:ascii="Arial" w:hAnsi="Arial" w:cs="Arial"/>
+        </w:rPr>
         <w:tab/>
         <w:t xml:space="preserve">N. Veronese, </w:t>
       </w:r>
       <w:r>
         <w:rPr>
+          <w:rFonts w:ascii="Arial" w:hAnsi="Arial" w:cs="Arial"/>
           <w:i/>
           <w:iCs/>
         </w:rPr>
         <w:t>et al.</w:t>
       </w:r>
       <w:r>
+        <w:rPr>
+          <w:rFonts w:ascii="Arial" w:hAnsi="Arial" w:cs="Arial"/>
+        </w:rPr>
         <w:t xml:space="preserve">, Prevalence of multidimensional frailty and pre-frailty in older people in different settings: A systematic review and meta-analysis. </w:t>
       </w:r>
       <w:r>
         <w:rPr>
+          <w:rFonts w:ascii="Arial" w:hAnsi="Arial" w:cs="Arial"/>
           <w:i/>
           <w:iCs/>
         </w:rPr>
         <w:t>Ageing Research Reviews</w:t>
       </w:r>
       <w:r>
+        <w:rPr>
+          <w:rFonts w:ascii="Arial" w:hAnsi="Arial" w:cs="Arial"/>
+        </w:rPr>
         <w:t xml:space="preserve"> </w:t>
       </w:r>
       <w:r>
         <w:rPr>
+          <w:rFonts w:ascii="Arial" w:hAnsi="Arial" w:cs="Arial"/>
           <w:b/>
           <w:bCs/>
         </w:rPr>
         <w:t>72</w:t>
       </w:r>
       <w:r>
+        <w:rPr>
+          <w:rFonts w:ascii="Arial" w:hAnsi="Arial" w:cs="Arial"/>
+        </w:rPr>
         <w:t>, 101498 (2021).</w:t>
       </w:r>
     </w:p>
     <w:p>
       <w:pPr>
         <w:pStyle w:val="Bibliography"/>
-      </w:pPr>
-      <w:r>
+        <w:rPr>
+          <w:rFonts w:ascii="Arial" w:hAnsi="Arial" w:cs="Arial"/>
+        </w:rPr>
+      </w:pPr>
+      <w:r>
+        <w:rPr>
+          <w:rFonts w:ascii="Arial" w:hAnsi="Arial" w:cs="Arial"/>
+        </w:rPr>
         <w:t xml:space="preserve">14. </w:t>
       </w:r>
       <w:r>
+        <w:rPr>
+          <w:rFonts w:ascii="Arial" w:hAnsi="Arial" w:cs="Arial"/>
+        </w:rPr>
         <w:tab/>
         <w:t xml:space="preserve">C. O. Weiss, C. M. Boyd, Q. Yu, J. L. Wolff, B. Leff, Patterns of Prevalent Major Chronic Disease Among Older Adults in the United States. </w:t>
       </w:r>
       <w:r>
         <w:rPr>
+          <w:rFonts w:ascii="Arial" w:hAnsi="Arial" w:cs="Arial"/>
           <w:i/>
           <w:iCs/>
         </w:rPr>
         <w:t>JAMA</w:t>
       </w:r>
       <w:r>
+        <w:rPr>
+          <w:rFonts w:ascii="Arial" w:hAnsi="Arial" w:cs="Arial"/>
+        </w:rPr>
         <w:t xml:space="preserve"> </w:t>
       </w:r>
       <w:r>
         <w:rPr>
+          <w:rFonts w:ascii="Arial" w:hAnsi="Arial" w:cs="Arial"/>
           <w:b/>
           <w:bCs/>
         </w:rPr>
         <w:t>298</w:t>
       </w:r>
       <w:r>
+        <w:rPr>
+          <w:rFonts w:ascii="Arial" w:hAnsi="Arial" w:cs="Arial"/>
+        </w:rPr>
         <w:t>, 1158 (2007).</w:t>
       </w:r>
     </w:p>
     <w:p>
       <w:pPr>
         <w:pStyle w:val="Bibliography"/>
-      </w:pPr>
-      <w:r>
+        <w:rPr>
+          <w:rFonts w:ascii="Arial" w:hAnsi="Arial" w:cs="Arial"/>
+        </w:rPr>
+      </w:pPr>
+      <w:r>
+        <w:rPr>
+          <w:rFonts w:ascii="Arial" w:hAnsi="Arial" w:cs="Arial"/>
+        </w:rPr>
         <w:t xml:space="preserve">15. </w:t>
       </w:r>
       <w:r>
+        <w:rPr>
+          <w:rFonts w:ascii="Arial" w:hAnsi="Arial" w:cs="Arial"/>
+        </w:rPr>
         <w:tab/>
         <w:t xml:space="preserve">A. Yazdanyar, A. B. Newman, The Burden of Cardiovascular Disease in the Elderly: Morbidity, Mortality, and Costs. </w:t>
       </w:r>
       <w:r>
         <w:rPr>
+          <w:rFonts w:ascii="Arial" w:hAnsi="Arial" w:cs="Arial"/>
           <w:i/>
           <w:iCs/>
         </w:rPr>
         <w:t>Clinics in Geriatric Medicine</w:t>
       </w:r>
       <w:r>
+        <w:rPr>
+          <w:rFonts w:ascii="Arial" w:hAnsi="Arial" w:cs="Arial"/>
+        </w:rPr>
         <w:t xml:space="preserve"> </w:t>
       </w:r>
       <w:r>
         <w:rPr>
+          <w:rFonts w:ascii="Arial" w:hAnsi="Arial" w:cs="Arial"/>
           <w:b/>
           <w:bCs/>
         </w:rPr>
         <w:t>25</w:t>
       </w:r>
       <w:r>
+        <w:rPr>
+          <w:rFonts w:ascii="Arial" w:hAnsi="Arial" w:cs="Arial"/>
+        </w:rPr>
         <w:t>, 563–577 (2009).</w:t>
       </w:r>
     </w:p>
     <w:p>
       <w:pPr>
         <w:pStyle w:val="Bibliography"/>
-      </w:pPr>
-      <w:r>
+        <w:rPr>
+          <w:rFonts w:ascii="Arial" w:hAnsi="Arial" w:cs="Arial"/>
+        </w:rPr>
+      </w:pPr>
+      <w:r>
+        <w:rPr>
+          <w:rFonts w:ascii="Arial" w:hAnsi="Arial" w:cs="Arial"/>
+        </w:rPr>
         <w:t xml:space="preserve">16. </w:t>
       </w:r>
       <w:r>
+        <w:rPr>
+          <w:rFonts w:ascii="Arial" w:hAnsi="Arial" w:cs="Arial"/>
+        </w:rPr>
         <w:tab/>
         <w:t xml:space="preserve">L. Dahlberg, K. J. McKee, A. Frank, M. Naseer, A systematic review of longitudinal risk factors for loneliness in older adults. </w:t>
       </w:r>
       <w:r>
         <w:rPr>
+          <w:rFonts w:ascii="Arial" w:hAnsi="Arial" w:cs="Arial"/>
           <w:i/>
           <w:iCs/>
         </w:rPr>
         <w:t>Aging &amp; Mental Health</w:t>
       </w:r>
       <w:r>
+        <w:rPr>
+          <w:rFonts w:ascii="Arial" w:hAnsi="Arial" w:cs="Arial"/>
+        </w:rPr>
         <w:t xml:space="preserve"> </w:t>
       </w:r>
       <w:r>
         <w:rPr>
+          <w:rFonts w:ascii="Arial" w:hAnsi="Arial" w:cs="Arial"/>
           <w:b/>
           <w:bCs/>
         </w:rPr>
         <w:t>26</w:t>
       </w:r>
       <w:r>
+        <w:rPr>
+          <w:rFonts w:ascii="Arial" w:hAnsi="Arial" w:cs="Arial"/>
+        </w:rPr>
         <w:t>, 225–249 (2022).</w:t>
       </w:r>
     </w:p>
     <w:p>
       <w:pPr>
         <w:pStyle w:val="Bibliography"/>
-      </w:pPr>
-      <w:r>
+        <w:rPr>
+          <w:rFonts w:ascii="Arial" w:hAnsi="Arial" w:cs="Arial"/>
+        </w:rPr>
+      </w:pPr>
+      <w:r>
+        <w:rPr>
+          <w:rFonts w:ascii="Arial" w:hAnsi="Arial" w:cs="Arial"/>
+        </w:rPr>
         <w:t xml:space="preserve">17. </w:t>
       </w:r>
       <w:r>
+        <w:rPr>
+          <w:rFonts w:ascii="Arial" w:hAnsi="Arial" w:cs="Arial"/>
+        </w:rPr>
         <w:tab/>
         <w:t xml:space="preserve">P. Hoang, </w:t>
       </w:r>
       <w:r>
         <w:rPr>
+          <w:rFonts w:ascii="Arial" w:hAnsi="Arial" w:cs="Arial"/>
           <w:i/>
           <w:iCs/>
         </w:rPr>
         <w:t>et al.</w:t>
       </w:r>
       <w:r>
+        <w:rPr>
+          <w:rFonts w:ascii="Arial" w:hAnsi="Arial" w:cs="Arial"/>
+        </w:rPr>
         <w:t xml:space="preserve">, Interventions Associated With Reduced Loneliness and Social Isolation in Older Adults: A Systematic Review and Meta-analysis. </w:t>
       </w:r>
       <w:r>
         <w:rPr>
+          <w:rFonts w:ascii="Arial" w:hAnsi="Arial" w:cs="Arial"/>
           <w:i/>
           <w:iCs/>
         </w:rPr>
         <w:t>JAMA Netw Open</w:t>
       </w:r>
       <w:r>
+        <w:rPr>
+          <w:rFonts w:ascii="Arial" w:hAnsi="Arial" w:cs="Arial"/>
+        </w:rPr>
         <w:t xml:space="preserve"> </w:t>
       </w:r>
       <w:r>
         <w:rPr>
+          <w:rFonts w:ascii="Arial" w:hAnsi="Arial" w:cs="Arial"/>
           <w:b/>
           <w:bCs/>
         </w:rPr>
         <w:t>5</w:t>
       </w:r>
       <w:r>
+        <w:rPr>
+          <w:rFonts w:ascii="Arial" w:hAnsi="Arial" w:cs="Arial"/>
+        </w:rPr>
         <w:t>, e2236676 (2022).</w:t>
       </w:r>
     </w:p>
     <w:p>
       <w:pPr>
         <w:pStyle w:val="Bibliography"/>
-      </w:pPr>
-      <w:r>
+        <w:rPr>
+          <w:rFonts w:ascii="Arial" w:hAnsi="Arial" w:cs="Arial"/>
+        </w:rPr>
+      </w:pPr>
+      <w:r>
+        <w:rPr>
+          <w:rFonts w:ascii="Arial" w:hAnsi="Arial" w:cs="Arial"/>
+        </w:rPr>
         <w:t xml:space="preserve">18. </w:t>
       </w:r>
       <w:r>
+        <w:rPr>
+          <w:rFonts w:ascii="Arial" w:hAnsi="Arial" w:cs="Arial"/>
+        </w:rPr>
         <w:tab/>
         <w:t xml:space="preserve">N. A. M. Molinari, B. Chen, N. Krishna, T. Morris, Who’s at Risk When the Power Goes Out? The At-home Electricity-Dependent Population in the United States, 2012. </w:t>
       </w:r>
       <w:r>
         <w:rPr>
+          <w:rFonts w:ascii="Arial" w:hAnsi="Arial" w:cs="Arial"/>
           <w:i/>
           <w:iCs/>
         </w:rPr>
         <w:t>Journal of Public Health Management and Practice</w:t>
       </w:r>
       <w:r>
+        <w:rPr>
+          <w:rFonts w:ascii="Arial" w:hAnsi="Arial" w:cs="Arial"/>
+        </w:rPr>
         <w:t xml:space="preserve"> </w:t>
       </w:r>
       <w:r>
         <w:rPr>
+          <w:rFonts w:ascii="Arial" w:hAnsi="Arial" w:cs="Arial"/>
           <w:b/>
           <w:bCs/>
         </w:rPr>
         <w:t>23</w:t>
       </w:r>
       <w:r>
+        <w:rPr>
+          <w:rFonts w:ascii="Arial" w:hAnsi="Arial" w:cs="Arial"/>
+        </w:rPr>
         <w:t>, 152–159 (2017).</w:t>
       </w:r>
     </w:p>
     <w:p>
       <w:pPr>
         <w:pStyle w:val="Bibliography"/>
-      </w:pPr>
-      <w:r>
+        <w:rPr>
+          <w:rFonts w:ascii="Arial" w:hAnsi="Arial" w:cs="Arial"/>
+        </w:rPr>
+      </w:pPr>
+      <w:r>
+        <w:rPr>
+          <w:rFonts w:ascii="Arial" w:hAnsi="Arial" w:cs="Arial"/>
+        </w:rPr>
         <w:t xml:space="preserve">19. </w:t>
       </w:r>
       <w:r>
+        <w:rPr>
+          <w:rFonts w:ascii="Arial" w:hAnsi="Arial" w:cs="Arial"/>
+        </w:rPr>
         <w:tab/>
         <w:t xml:space="preserve">W. Zhang, </w:t>
       </w:r>
       <w:r>
         <w:rPr>
+          <w:rFonts w:ascii="Arial" w:hAnsi="Arial" w:cs="Arial"/>
           <w:i/>
           <w:iCs/>
         </w:rPr>
         <w:t>et al.</w:t>
       </w:r>
       <w:r>
+        <w:rPr>
+          <w:rFonts w:ascii="Arial" w:hAnsi="Arial" w:cs="Arial"/>
+        </w:rPr>
         <w:t xml:space="preserve">, Power Outage: An Ignored Risk Factor for COPD Exacerbations. </w:t>
       </w:r>
       <w:r>
         <w:rPr>
+          <w:rFonts w:ascii="Arial" w:hAnsi="Arial" w:cs="Arial"/>
           <w:i/>
           <w:iCs/>
         </w:rPr>
         <w:t>Chest</w:t>
       </w:r>
       <w:r>
+        <w:rPr>
+          <w:rFonts w:ascii="Arial" w:hAnsi="Arial" w:cs="Arial"/>
+        </w:rPr>
         <w:t xml:space="preserve"> </w:t>
       </w:r>
       <w:r>
         <w:rPr>
+          <w:rFonts w:ascii="Arial" w:hAnsi="Arial" w:cs="Arial"/>
           <w:b/>
           <w:bCs/>
         </w:rPr>
         <w:t>158</w:t>
       </w:r>
       <w:r>
+        <w:rPr>
+          <w:rFonts w:ascii="Arial" w:hAnsi="Arial" w:cs="Arial"/>
+        </w:rPr>
         <w:t>, 2346–2357 (2020).</w:t>
       </w:r>
     </w:p>
     <w:p>
       <w:pPr>
         <w:pStyle w:val="Bibliography"/>
-      </w:pPr>
-      <w:r>
+        <w:rPr>
+          <w:rFonts w:ascii="Arial" w:hAnsi="Arial" w:cs="Arial"/>
+        </w:rPr>
+      </w:pPr>
+      <w:r>
+        <w:rPr>
+          <w:rFonts w:ascii="Arial" w:hAnsi="Arial" w:cs="Arial"/>
+        </w:rPr>
         <w:t xml:space="preserve">20. </w:t>
       </w:r>
       <w:r>
+        <w:rPr>
+          <w:rFonts w:ascii="Arial" w:hAnsi="Arial" w:cs="Arial"/>
+        </w:rPr>
         <w:tab/>
         <w:t xml:space="preserve">S. Lin, </w:t>
       </w:r>
       <w:r>
         <w:rPr>
+          <w:rFonts w:ascii="Arial" w:hAnsi="Arial" w:cs="Arial"/>
           <w:i/>
           <w:iCs/>
         </w:rPr>
         <w:t>et al.</w:t>
       </w:r>
       <w:r>
+        <w:rPr>
+          <w:rFonts w:ascii="Arial" w:hAnsi="Arial" w:cs="Arial"/>
+        </w:rPr>
         <w:t xml:space="preserve">, The Joint Effects of Thunderstorms and Power Outages on Respiratory-Related Emergency Visits and Modifying and Mediating Factors of This Relationship. </w:t>
       </w:r>
       <w:r>
         <w:rPr>
+          <w:rFonts w:ascii="Arial" w:hAnsi="Arial" w:cs="Arial"/>
           <w:i/>
           <w:iCs/>
         </w:rPr>
         <w:t>Environ Health Perspect</w:t>
       </w:r>
       <w:r>
+        <w:rPr>
+          <w:rFonts w:ascii="Arial" w:hAnsi="Arial" w:cs="Arial"/>
+        </w:rPr>
         <w:t xml:space="preserve"> </w:t>
       </w:r>
       <w:r>
         <w:rPr>
+          <w:rFonts w:ascii="Arial" w:hAnsi="Arial" w:cs="Arial"/>
           <w:b/>
           <w:bCs/>
         </w:rPr>
         <w:t>132</w:t>
       </w:r>
       <w:r>
+        <w:rPr>
+          <w:rFonts w:ascii="Arial" w:hAnsi="Arial" w:cs="Arial"/>
+        </w:rPr>
         <w:t>, 067002 (2024).</w:t>
       </w:r>
     </w:p>
     <w:p>
       <w:pPr>
         <w:pStyle w:val="Bibliography"/>
-      </w:pPr>
-      <w:r>
+        <w:rPr>
+          <w:rFonts w:ascii="Arial" w:hAnsi="Arial" w:cs="Arial"/>
+        </w:rPr>
+      </w:pPr>
+      <w:r>
+        <w:rPr>
+          <w:rFonts w:ascii="Arial" w:hAnsi="Arial" w:cs="Arial"/>
+        </w:rPr>
         <w:t xml:space="preserve">21. </w:t>
       </w:r>
       <w:r>
+        <w:rPr>
+          <w:rFonts w:ascii="Arial" w:hAnsi="Arial" w:cs="Arial"/>
+        </w:rPr>
         <w:tab/>
         <w:t xml:space="preserve">C. Dominianni, K. Lane, S. Johnson, K. Ito, T. Matte, Health Impacts of Citywide and Localized Power Outages in New York City. </w:t>
       </w:r>
       <w:r>
         <w:rPr>
+          <w:rFonts w:ascii="Arial" w:hAnsi="Arial" w:cs="Arial"/>
           <w:i/>
           <w:iCs/>
         </w:rPr>
         <w:t>Environ Health Perspect</w:t>
       </w:r>
       <w:r>
+        <w:rPr>
+          <w:rFonts w:ascii="Arial" w:hAnsi="Arial" w:cs="Arial"/>
+        </w:rPr>
         <w:t xml:space="preserve"> </w:t>
       </w:r>
       <w:r>
         <w:rPr>
+          <w:rFonts w:ascii="Arial" w:hAnsi="Arial" w:cs="Arial"/>
           <w:b/>
           <w:bCs/>
         </w:rPr>
         <w:t>126</w:t>
       </w:r>
       <w:r>
+        <w:rPr>
+          <w:rFonts w:ascii="Arial" w:hAnsi="Arial" w:cs="Arial"/>
+        </w:rPr>
         <w:t>, 067003 (2018).</w:t>
       </w:r>
     </w:p>
     <w:p>
       <w:pPr>
         <w:pStyle w:val="Bibliography"/>
-      </w:pPr>
-      <w:r>
+        <w:rPr>
+          <w:rFonts w:ascii="Arial" w:hAnsi="Arial" w:cs="Arial"/>
+        </w:rPr>
+      </w:pPr>
+      <w:r>
+        <w:rPr>
+          <w:rFonts w:ascii="Arial" w:hAnsi="Arial" w:cs="Arial"/>
+        </w:rPr>
         <w:t xml:space="preserve">22. </w:t>
       </w:r>
       <w:r>
+        <w:rPr>
+          <w:rFonts w:ascii="Arial" w:hAnsi="Arial" w:cs="Arial"/>
+        </w:rPr>
         <w:tab/>
         <w:t xml:space="preserve">G. B. Anderson, M. L. Bell, Lights Out: Impact of the August 2003 Power Outage on Mortality in New York, NY. </w:t>
       </w:r>
       <w:r>
         <w:rPr>
+          <w:rFonts w:ascii="Arial" w:hAnsi="Arial" w:cs="Arial"/>
           <w:i/>
           <w:iCs/>
         </w:rPr>
         <w:t>Epidemiology</w:t>
       </w:r>
       <w:r>
+        <w:rPr>
+          <w:rFonts w:ascii="Arial" w:hAnsi="Arial" w:cs="Arial"/>
+        </w:rPr>
         <w:t xml:space="preserve"> </w:t>
       </w:r>
       <w:r>
         <w:rPr>
+          <w:rFonts w:ascii="Arial" w:hAnsi="Arial" w:cs="Arial"/>
           <w:b/>
           <w:bCs/>
         </w:rPr>
         <w:t>23</w:t>
       </w:r>
       <w:r>
+        <w:rPr>
+          <w:rFonts w:ascii="Arial" w:hAnsi="Arial" w:cs="Arial"/>
+        </w:rPr>
         <w:t>, 189–193 (2012).</w:t>
       </w:r>
     </w:p>
     <w:p>
       <w:pPr>
         <w:pStyle w:val="Bibliography"/>
-      </w:pPr>
-      <w:r>
+        <w:rPr>
+          <w:rFonts w:ascii="Arial" w:hAnsi="Arial" w:cs="Arial"/>
+        </w:rPr>
+      </w:pPr>
+      <w:r>
+        <w:rPr>
+          <w:rFonts w:ascii="Arial" w:hAnsi="Arial" w:cs="Arial"/>
+        </w:rPr>
         <w:t xml:space="preserve">23. </w:t>
       </w:r>
       <w:r>
+        <w:rPr>
+          <w:rFonts w:ascii="Arial" w:hAnsi="Arial" w:cs="Arial"/>
+        </w:rPr>
         <w:tab/>
         <w:t>Oak Ridge National Laboratory, Oak Ridge National Laboratory, EAGLE-I Outage Data 2014-2022. Available at: https://smc-datachallenge.ornl.gov/eagle/ [Accessed 3 January 2025].</w:t>
       </w:r>
@@ -12347,11 +12848,20 @@
     <w:p>
       <w:pPr>
         <w:pStyle w:val="Bibliography"/>
-      </w:pPr>
-      <w:r>
+        <w:rPr>
+          <w:rFonts w:ascii="Arial" w:hAnsi="Arial" w:cs="Arial"/>
+        </w:rPr>
+      </w:pPr>
+      <w:r>
+        <w:rPr>
+          <w:rFonts w:ascii="Arial" w:hAnsi="Arial" w:cs="Arial"/>
+        </w:rPr>
         <w:t xml:space="preserve">24. </w:t>
       </w:r>
       <w:r>
+        <w:rPr>
+          <w:rFonts w:ascii="Arial" w:hAnsi="Arial" w:cs="Arial"/>
+        </w:rPr>
         <w:tab/>
         <w:t>PowerOutage.us. Available at: https://poweroutage.us/.</w:t>
       </w:r>
@@ -12359,779 +12869,1203 @@
     <w:p>
       <w:pPr>
         <w:pStyle w:val="Bibliography"/>
-      </w:pPr>
-      <w:r>
+        <w:rPr>
+          <w:rFonts w:ascii="Arial" w:hAnsi="Arial" w:cs="Arial"/>
+        </w:rPr>
+      </w:pPr>
+      <w:r>
+        <w:rPr>
+          <w:rFonts w:ascii="Arial" w:hAnsi="Arial" w:cs="Arial"/>
+        </w:rPr>
         <w:t xml:space="preserve">25. </w:t>
       </w:r>
       <w:r>
+        <w:rPr>
+          <w:rFonts w:ascii="Arial" w:hAnsi="Arial" w:cs="Arial"/>
+        </w:rPr>
         <w:tab/>
         <w:t xml:space="preserve">V. Do, The impact of power outages on cardiovascular hospitalizations among Medicare enrollees in New York State, 2017-2018. </w:t>
       </w:r>
       <w:r>
         <w:rPr>
+          <w:rFonts w:ascii="Arial" w:hAnsi="Arial" w:cs="Arial"/>
           <w:i/>
           <w:iCs/>
         </w:rPr>
         <w:t>Under review at Epidemiology</w:t>
       </w:r>
       <w:r>
+        <w:rPr>
+          <w:rFonts w:ascii="Arial" w:hAnsi="Arial" w:cs="Arial"/>
+        </w:rPr>
         <w:t>.</w:t>
       </w:r>
     </w:p>
     <w:p>
       <w:pPr>
         <w:pStyle w:val="Bibliography"/>
-      </w:pPr>
-      <w:r>
+        <w:rPr>
+          <w:rFonts w:ascii="Arial" w:hAnsi="Arial" w:cs="Arial"/>
+        </w:rPr>
+      </w:pPr>
+      <w:r>
+        <w:rPr>
+          <w:rFonts w:ascii="Arial" w:hAnsi="Arial" w:cs="Arial"/>
+        </w:rPr>
+        <w:lastRenderedPageBreak/>
         <w:t xml:space="preserve">26. </w:t>
       </w:r>
       <w:r>
+        <w:rPr>
+          <w:rFonts w:ascii="Arial" w:hAnsi="Arial" w:cs="Arial"/>
+        </w:rPr>
         <w:tab/>
         <w:t xml:space="preserve">G. B. Anderson, </w:t>
       </w:r>
       <w:r>
         <w:rPr>
+          <w:rFonts w:ascii="Arial" w:hAnsi="Arial" w:cs="Arial"/>
           <w:i/>
           <w:iCs/>
         </w:rPr>
         <w:t>et al.</w:t>
       </w:r>
       <w:r>
+        <w:rPr>
+          <w:rFonts w:ascii="Arial" w:hAnsi="Arial" w:cs="Arial"/>
+        </w:rPr>
         <w:t xml:space="preserve">, Heat-related Emergency Hospitalizations for Respiratory Diseases in the Medicare Population. </w:t>
       </w:r>
       <w:r>
         <w:rPr>
+          <w:rFonts w:ascii="Arial" w:hAnsi="Arial" w:cs="Arial"/>
           <w:i/>
           <w:iCs/>
         </w:rPr>
         <w:t>Am J Respir Crit Care Med</w:t>
       </w:r>
       <w:r>
+        <w:rPr>
+          <w:rFonts w:ascii="Arial" w:hAnsi="Arial" w:cs="Arial"/>
+        </w:rPr>
         <w:t xml:space="preserve"> </w:t>
       </w:r>
       <w:r>
         <w:rPr>
+          <w:rFonts w:ascii="Arial" w:hAnsi="Arial" w:cs="Arial"/>
           <w:b/>
           <w:bCs/>
         </w:rPr>
         <w:t>187</w:t>
       </w:r>
       <w:r>
+        <w:rPr>
+          <w:rFonts w:ascii="Arial" w:hAnsi="Arial" w:cs="Arial"/>
+        </w:rPr>
         <w:t>, 1098–1103 (2013).</w:t>
       </w:r>
     </w:p>
     <w:p>
       <w:pPr>
         <w:pStyle w:val="Bibliography"/>
-      </w:pPr>
-      <w:r>
-        <w:lastRenderedPageBreak/>
+        <w:rPr>
+          <w:rFonts w:ascii="Arial" w:hAnsi="Arial" w:cs="Arial"/>
+        </w:rPr>
+      </w:pPr>
+      <w:r>
+        <w:rPr>
+          <w:rFonts w:ascii="Arial" w:hAnsi="Arial" w:cs="Arial"/>
+        </w:rPr>
         <w:t xml:space="preserve">27. </w:t>
       </w:r>
       <w:r>
+        <w:rPr>
+          <w:rFonts w:ascii="Arial" w:hAnsi="Arial" w:cs="Arial"/>
+        </w:rPr>
         <w:tab/>
         <w:t xml:space="preserve">S. Lin, </w:t>
       </w:r>
       <w:r>
         <w:rPr>
+          <w:rFonts w:ascii="Arial" w:hAnsi="Arial" w:cs="Arial"/>
           <w:i/>
           <w:iCs/>
         </w:rPr>
         <w:t>et al.</w:t>
       </w:r>
       <w:r>
+        <w:rPr>
+          <w:rFonts w:ascii="Arial" w:hAnsi="Arial" w:cs="Arial"/>
+        </w:rPr>
         <w:t xml:space="preserve">, Extreme High Temperatures and Hospital Admissions for Respiratory and Cardiovascular Diseases. </w:t>
       </w:r>
       <w:r>
         <w:rPr>
+          <w:rFonts w:ascii="Arial" w:hAnsi="Arial" w:cs="Arial"/>
           <w:i/>
           <w:iCs/>
         </w:rPr>
         <w:t>Epidemiology</w:t>
       </w:r>
       <w:r>
+        <w:rPr>
+          <w:rFonts w:ascii="Arial" w:hAnsi="Arial" w:cs="Arial"/>
+        </w:rPr>
         <w:t xml:space="preserve"> </w:t>
       </w:r>
       <w:r>
         <w:rPr>
+          <w:rFonts w:ascii="Arial" w:hAnsi="Arial" w:cs="Arial"/>
           <w:b/>
           <w:bCs/>
         </w:rPr>
         <w:t>20</w:t>
       </w:r>
       <w:r>
+        <w:rPr>
+          <w:rFonts w:ascii="Arial" w:hAnsi="Arial" w:cs="Arial"/>
+        </w:rPr>
         <w:t>, 738–746 (2009).</w:t>
       </w:r>
     </w:p>
     <w:p>
       <w:pPr>
         <w:pStyle w:val="Bibliography"/>
-      </w:pPr>
-      <w:r>
+        <w:rPr>
+          <w:rFonts w:ascii="Arial" w:hAnsi="Arial" w:cs="Arial"/>
+        </w:rPr>
+      </w:pPr>
+      <w:r>
+        <w:rPr>
+          <w:rFonts w:ascii="Arial" w:hAnsi="Arial" w:cs="Arial"/>
+        </w:rPr>
         <w:t xml:space="preserve">28. </w:t>
       </w:r>
       <w:r>
+        <w:rPr>
+          <w:rFonts w:ascii="Arial" w:hAnsi="Arial" w:cs="Arial"/>
+        </w:rPr>
         <w:tab/>
         <w:t xml:space="preserve">N. Singh, </w:t>
       </w:r>
       <w:r>
         <w:rPr>
+          <w:rFonts w:ascii="Arial" w:hAnsi="Arial" w:cs="Arial"/>
           <w:i/>
           <w:iCs/>
         </w:rPr>
         <w:t>et al.</w:t>
       </w:r>
       <w:r>
+        <w:rPr>
+          <w:rFonts w:ascii="Arial" w:hAnsi="Arial" w:cs="Arial"/>
+        </w:rPr>
         <w:t xml:space="preserve">, Heat and Cardiovascular Mortality: An Epidemiological Perspective. </w:t>
       </w:r>
       <w:r>
         <w:rPr>
+          <w:rFonts w:ascii="Arial" w:hAnsi="Arial" w:cs="Arial"/>
           <w:i/>
           <w:iCs/>
         </w:rPr>
         <w:t>Circulation Research</w:t>
       </w:r>
       <w:r>
+        <w:rPr>
+          <w:rFonts w:ascii="Arial" w:hAnsi="Arial" w:cs="Arial"/>
+        </w:rPr>
         <w:t xml:space="preserve"> </w:t>
       </w:r>
       <w:r>
         <w:rPr>
+          <w:rFonts w:ascii="Arial" w:hAnsi="Arial" w:cs="Arial"/>
           <w:b/>
           <w:bCs/>
         </w:rPr>
         <w:t>134</w:t>
       </w:r>
       <w:r>
+        <w:rPr>
+          <w:rFonts w:ascii="Arial" w:hAnsi="Arial" w:cs="Arial"/>
+        </w:rPr>
         <w:t>, 1098–1112 (2024).</w:t>
       </w:r>
     </w:p>
     <w:p>
       <w:pPr>
         <w:pStyle w:val="Bibliography"/>
-      </w:pPr>
-      <w:r>
+        <w:rPr>
+          <w:rFonts w:ascii="Arial" w:hAnsi="Arial" w:cs="Arial"/>
+        </w:rPr>
+      </w:pPr>
+      <w:r>
+        <w:rPr>
+          <w:rFonts w:ascii="Arial" w:hAnsi="Arial" w:cs="Arial"/>
+        </w:rPr>
         <w:t xml:space="preserve">29. </w:t>
       </w:r>
       <w:r>
+        <w:rPr>
+          <w:rFonts w:ascii="Arial" w:hAnsi="Arial" w:cs="Arial"/>
+        </w:rPr>
         <w:tab/>
         <w:t xml:space="preserve">V. Do, </w:t>
       </w:r>
       <w:r>
         <w:rPr>
+          <w:rFonts w:ascii="Arial" w:hAnsi="Arial" w:cs="Arial"/>
           <w:i/>
           <w:iCs/>
         </w:rPr>
         <w:t>et al.</w:t>
       </w:r>
       <w:r>
+        <w:rPr>
+          <w:rFonts w:ascii="Arial" w:hAnsi="Arial" w:cs="Arial"/>
+        </w:rPr>
         <w:t>, Spatiotemporal patterns of power outages co-occurring with individual and multiple severe weather events in the United States, 2018-2020. [Preprint] (2024). Available at: https://www.researchsquare.com/article/rs-4752336/v1 [Accessed 4 January 2025].</w:t>
       </w:r>
     </w:p>
     <w:p>
       <w:pPr>
         <w:pStyle w:val="Bibliography"/>
-      </w:pPr>
-      <w:r>
+        <w:rPr>
+          <w:rFonts w:ascii="Arial" w:hAnsi="Arial" w:cs="Arial"/>
+        </w:rPr>
+      </w:pPr>
+      <w:r>
+        <w:rPr>
+          <w:rFonts w:ascii="Arial" w:hAnsi="Arial" w:cs="Arial"/>
+        </w:rPr>
         <w:t xml:space="preserve">30. </w:t>
       </w:r>
       <w:r>
+        <w:rPr>
+          <w:rFonts w:ascii="Arial" w:hAnsi="Arial" w:cs="Arial"/>
+        </w:rPr>
         <w:tab/>
         <w:t xml:space="preserve">H. M. Salman, J. Pasupuleti, A. H. Sabry, Review on Causes of Power Outages and Their Occurrence: Mitigation Strategies. </w:t>
       </w:r>
       <w:r>
         <w:rPr>
+          <w:rFonts w:ascii="Arial" w:hAnsi="Arial" w:cs="Arial"/>
           <w:i/>
           <w:iCs/>
         </w:rPr>
         <w:t>Sustainability</w:t>
       </w:r>
       <w:r>
+        <w:rPr>
+          <w:rFonts w:ascii="Arial" w:hAnsi="Arial" w:cs="Arial"/>
+        </w:rPr>
         <w:t xml:space="preserve"> </w:t>
       </w:r>
       <w:r>
         <w:rPr>
+          <w:rFonts w:ascii="Arial" w:hAnsi="Arial" w:cs="Arial"/>
           <w:b/>
           <w:bCs/>
         </w:rPr>
         <w:t>15</w:t>
       </w:r>
       <w:r>
+        <w:rPr>
+          <w:rFonts w:ascii="Arial" w:hAnsi="Arial" w:cs="Arial"/>
+        </w:rPr>
         <w:t>, 15001 (2023).</w:t>
       </w:r>
     </w:p>
     <w:p>
       <w:pPr>
         <w:pStyle w:val="Bibliography"/>
-      </w:pPr>
-      <w:r>
+        <w:rPr>
+          <w:rFonts w:ascii="Arial" w:hAnsi="Arial" w:cs="Arial"/>
+        </w:rPr>
+      </w:pPr>
+      <w:r>
+        <w:rPr>
+          <w:rFonts w:ascii="Arial" w:hAnsi="Arial" w:cs="Arial"/>
+        </w:rPr>
         <w:t xml:space="preserve">31. </w:t>
       </w:r>
       <w:r>
+        <w:rPr>
+          <w:rFonts w:ascii="Arial" w:hAnsi="Arial" w:cs="Arial"/>
+        </w:rPr>
         <w:tab/>
         <w:t xml:space="preserve">X. Deng, </w:t>
       </w:r>
       <w:r>
         <w:rPr>
+          <w:rFonts w:ascii="Arial" w:hAnsi="Arial" w:cs="Arial"/>
           <w:i/>
           <w:iCs/>
         </w:rPr>
         <w:t>et al.</w:t>
       </w:r>
       <w:r>
+        <w:rPr>
+          <w:rFonts w:ascii="Arial" w:hAnsi="Arial" w:cs="Arial"/>
+        </w:rPr>
         <w:t xml:space="preserve">, The independent and synergistic impacts of power outages and floods on hospital admissions for multiple diseases. </w:t>
       </w:r>
       <w:r>
         <w:rPr>
+          <w:rFonts w:ascii="Arial" w:hAnsi="Arial" w:cs="Arial"/>
           <w:i/>
           <w:iCs/>
         </w:rPr>
         <w:t>Science of The Total Environment</w:t>
       </w:r>
       <w:r>
+        <w:rPr>
+          <w:rFonts w:ascii="Arial" w:hAnsi="Arial" w:cs="Arial"/>
+        </w:rPr>
         <w:t xml:space="preserve"> </w:t>
       </w:r>
       <w:r>
         <w:rPr>
+          <w:rFonts w:ascii="Arial" w:hAnsi="Arial" w:cs="Arial"/>
           <w:b/>
           <w:bCs/>
         </w:rPr>
         <w:t>828</w:t>
       </w:r>
       <w:r>
+        <w:rPr>
+          <w:rFonts w:ascii="Arial" w:hAnsi="Arial" w:cs="Arial"/>
+        </w:rPr>
         <w:t>, 154305 (2022).</w:t>
       </w:r>
     </w:p>
     <w:p>
       <w:pPr>
         <w:pStyle w:val="Bibliography"/>
-      </w:pPr>
-      <w:r>
+        <w:rPr>
+          <w:rFonts w:ascii="Arial" w:hAnsi="Arial" w:cs="Arial"/>
+        </w:rPr>
+      </w:pPr>
+      <w:r>
+        <w:rPr>
+          <w:rFonts w:ascii="Arial" w:hAnsi="Arial" w:cs="Arial"/>
+        </w:rPr>
         <w:t xml:space="preserve">32. </w:t>
       </w:r>
       <w:r>
+        <w:rPr>
+          <w:rFonts w:ascii="Arial" w:hAnsi="Arial" w:cs="Arial"/>
+        </w:rPr>
         <w:tab/>
         <w:t xml:space="preserve">C. Klinger, O. Landeg, V. Murray, Power Outages, Extreme Events and Health: a Systematic Review of the Literature from 2011-2012. </w:t>
       </w:r>
       <w:r>
         <w:rPr>
+          <w:rFonts w:ascii="Arial" w:hAnsi="Arial" w:cs="Arial"/>
           <w:i/>
           <w:iCs/>
         </w:rPr>
         <w:t>PLOS Currents</w:t>
       </w:r>
       <w:r>
+        <w:rPr>
+          <w:rFonts w:ascii="Arial" w:hAnsi="Arial" w:cs="Arial"/>
+        </w:rPr>
         <w:t xml:space="preserve"> (2014).</w:t>
       </w:r>
     </w:p>
     <w:p>
       <w:pPr>
         <w:pStyle w:val="Bibliography"/>
-      </w:pPr>
-      <w:r>
+        <w:rPr>
+          <w:rFonts w:ascii="Arial" w:hAnsi="Arial" w:cs="Arial"/>
+        </w:rPr>
+      </w:pPr>
+      <w:r>
+        <w:rPr>
+          <w:rFonts w:ascii="Arial" w:hAnsi="Arial" w:cs="Arial"/>
+        </w:rPr>
         <w:t xml:space="preserve">33. </w:t>
       </w:r>
       <w:r>
+        <w:rPr>
+          <w:rFonts w:ascii="Arial" w:hAnsi="Arial" w:cs="Arial"/>
+        </w:rPr>
         <w:tab/>
         <w:t xml:space="preserve">R. J. Carroll, D. Ruppert, L. A. Stefanski, C. M. Crainiceanu, </w:t>
       </w:r>
       <w:r>
         <w:rPr>
+          <w:rFonts w:ascii="Arial" w:hAnsi="Arial" w:cs="Arial"/>
           <w:i/>
           <w:iCs/>
         </w:rPr>
         <w:t>Measurement Error in Nonlinear Models</w:t>
       </w:r>
       <w:r>
+        <w:rPr>
+          <w:rFonts w:ascii="Arial" w:hAnsi="Arial" w:cs="Arial"/>
+        </w:rPr>
         <w:t>.</w:t>
       </w:r>
     </w:p>
     <w:p>
       <w:pPr>
         <w:pStyle w:val="Bibliography"/>
-      </w:pPr>
-      <w:r>
+        <w:rPr>
+          <w:rFonts w:ascii="Arial" w:hAnsi="Arial" w:cs="Arial"/>
+        </w:rPr>
+      </w:pPr>
+      <w:r>
+        <w:rPr>
+          <w:rFonts w:ascii="Arial" w:hAnsi="Arial" w:cs="Arial"/>
+        </w:rPr>
         <w:t xml:space="preserve">34. </w:t>
       </w:r>
       <w:r>
+        <w:rPr>
+          <w:rFonts w:ascii="Arial" w:hAnsi="Arial" w:cs="Arial"/>
+        </w:rPr>
         <w:tab/>
         <w:t xml:space="preserve">C. Dominianni, </w:t>
       </w:r>
       <w:r>
         <w:rPr>
+          <w:rFonts w:ascii="Arial" w:hAnsi="Arial" w:cs="Arial"/>
           <w:i/>
           <w:iCs/>
         </w:rPr>
         <w:t>et al.</w:t>
       </w:r>
       <w:r>
+        <w:rPr>
+          <w:rFonts w:ascii="Arial" w:hAnsi="Arial" w:cs="Arial"/>
+        </w:rPr>
         <w:t xml:space="preserve">, Power Outage Preparedness and Concern among Vulnerable New York City Residents. </w:t>
       </w:r>
       <w:r>
         <w:rPr>
+          <w:rFonts w:ascii="Arial" w:hAnsi="Arial" w:cs="Arial"/>
           <w:i/>
           <w:iCs/>
         </w:rPr>
         <w:t>J Urban Health</w:t>
       </w:r>
       <w:r>
+        <w:rPr>
+          <w:rFonts w:ascii="Arial" w:hAnsi="Arial" w:cs="Arial"/>
+        </w:rPr>
         <w:t xml:space="preserve"> </w:t>
       </w:r>
       <w:r>
         <w:rPr>
+          <w:rFonts w:ascii="Arial" w:hAnsi="Arial" w:cs="Arial"/>
           <w:b/>
           <w:bCs/>
         </w:rPr>
         <w:t>95</w:t>
       </w:r>
       <w:r>
+        <w:rPr>
+          <w:rFonts w:ascii="Arial" w:hAnsi="Arial" w:cs="Arial"/>
+        </w:rPr>
         <w:t>, 716–726 (2018).</w:t>
       </w:r>
     </w:p>
     <w:p>
       <w:pPr>
         <w:pStyle w:val="Bibliography"/>
-      </w:pPr>
-      <w:r>
+        <w:rPr>
+          <w:rFonts w:ascii="Arial" w:hAnsi="Arial" w:cs="Arial"/>
+        </w:rPr>
+      </w:pPr>
+      <w:r>
+        <w:rPr>
+          <w:rFonts w:ascii="Arial" w:hAnsi="Arial" w:cs="Arial"/>
+        </w:rPr>
         <w:t xml:space="preserve">35. </w:t>
       </w:r>
       <w:r>
+        <w:rPr>
+          <w:rFonts w:ascii="Arial" w:hAnsi="Arial" w:cs="Arial"/>
+        </w:rPr>
         <w:tab/>
         <w:t xml:space="preserve">T. M. Al-rousan, L. M. Rubenstein, R. B. Wallace, Preparedness for Natural Disasters Among Older US Adults: A Nationwide Survey. </w:t>
       </w:r>
       <w:r>
         <w:rPr>
+          <w:rFonts w:ascii="Arial" w:hAnsi="Arial" w:cs="Arial"/>
           <w:i/>
           <w:iCs/>
         </w:rPr>
         <w:t>Am J Public Health</w:t>
       </w:r>
       <w:r>
+        <w:rPr>
+          <w:rFonts w:ascii="Arial" w:hAnsi="Arial" w:cs="Arial"/>
+        </w:rPr>
         <w:t xml:space="preserve"> </w:t>
       </w:r>
       <w:r>
         <w:rPr>
+          <w:rFonts w:ascii="Arial" w:hAnsi="Arial" w:cs="Arial"/>
           <w:b/>
           <w:bCs/>
         </w:rPr>
         <w:t>104</w:t>
       </w:r>
       <w:r>
+        <w:rPr>
+          <w:rFonts w:ascii="Arial" w:hAnsi="Arial" w:cs="Arial"/>
+        </w:rPr>
         <w:t>, 506–511 (2014).</w:t>
       </w:r>
     </w:p>
     <w:p>
       <w:pPr>
         <w:pStyle w:val="Bibliography"/>
-      </w:pPr>
-      <w:r>
+        <w:rPr>
+          <w:rFonts w:ascii="Arial" w:hAnsi="Arial" w:cs="Arial"/>
+        </w:rPr>
+      </w:pPr>
+      <w:r>
+        <w:rPr>
+          <w:rFonts w:ascii="Arial" w:hAnsi="Arial" w:cs="Arial"/>
+        </w:rPr>
         <w:t xml:space="preserve">36. </w:t>
       </w:r>
       <w:r>
+        <w:rPr>
+          <w:rFonts w:ascii="Arial" w:hAnsi="Arial" w:cs="Arial"/>
+        </w:rPr>
         <w:tab/>
         <w:t xml:space="preserve">J. Xu, Y. Qiang, H. Cai, L. Zou, Power outage and environmental justice in Winter Storm Uri: an analytical workflow based on nighttime light remote sensing. </w:t>
       </w:r>
       <w:r>
         <w:rPr>
+          <w:rFonts w:ascii="Arial" w:hAnsi="Arial" w:cs="Arial"/>
           <w:i/>
           <w:iCs/>
         </w:rPr>
         <w:t>International Journal of Digital Earth</w:t>
       </w:r>
       <w:r>
+        <w:rPr>
+          <w:rFonts w:ascii="Arial" w:hAnsi="Arial" w:cs="Arial"/>
+        </w:rPr>
         <w:t xml:space="preserve"> </w:t>
       </w:r>
       <w:r>
         <w:rPr>
+          <w:rFonts w:ascii="Arial" w:hAnsi="Arial" w:cs="Arial"/>
           <w:b/>
           <w:bCs/>
         </w:rPr>
         <w:t>16</w:t>
       </w:r>
       <w:r>
+        <w:rPr>
+          <w:rFonts w:ascii="Arial" w:hAnsi="Arial" w:cs="Arial"/>
+        </w:rPr>
         <w:t>, 2259–2278 (2023).</w:t>
       </w:r>
     </w:p>
     <w:p>
       <w:pPr>
         <w:pStyle w:val="Bibliography"/>
-      </w:pPr>
-      <w:r>
+        <w:rPr>
+          <w:rFonts w:ascii="Arial" w:hAnsi="Arial" w:cs="Arial"/>
+        </w:rPr>
+      </w:pPr>
+      <w:r>
+        <w:rPr>
+          <w:rFonts w:ascii="Arial" w:hAnsi="Arial" w:cs="Arial"/>
+        </w:rPr>
         <w:t xml:space="preserve">37. </w:t>
       </w:r>
       <w:r>
+        <w:rPr>
+          <w:rFonts w:ascii="Arial" w:hAnsi="Arial" w:cs="Arial"/>
+        </w:rPr>
         <w:tab/>
         <w:t xml:space="preserve">Z. Shah, </w:t>
       </w:r>
       <w:r>
         <w:rPr>
+          <w:rFonts w:ascii="Arial" w:hAnsi="Arial" w:cs="Arial"/>
           <w:i/>
           <w:iCs/>
         </w:rPr>
         <w:t>et al.</w:t>
       </w:r>
       <w:r>
+        <w:rPr>
+          <w:rFonts w:ascii="Arial" w:hAnsi="Arial" w:cs="Arial"/>
+        </w:rPr>
         <w:t xml:space="preserve">, The electricity scene from above: Exploring power grid inconsistencies using satellite data in Accra, Ghana. </w:t>
       </w:r>
       <w:r>
         <w:rPr>
+          <w:rFonts w:ascii="Arial" w:hAnsi="Arial" w:cs="Arial"/>
           <w:i/>
           <w:iCs/>
         </w:rPr>
         <w:t>Applied Energy</w:t>
       </w:r>
       <w:r>
+        <w:rPr>
+          <w:rFonts w:ascii="Arial" w:hAnsi="Arial" w:cs="Arial"/>
+        </w:rPr>
         <w:t xml:space="preserve"> </w:t>
       </w:r>
       <w:r>
         <w:rPr>
+          <w:rFonts w:ascii="Arial" w:hAnsi="Arial" w:cs="Arial"/>
           <w:b/>
           <w:bCs/>
         </w:rPr>
         <w:t>319</w:t>
       </w:r>
       <w:r>
+        <w:rPr>
+          <w:rFonts w:ascii="Arial" w:hAnsi="Arial" w:cs="Arial"/>
+        </w:rPr>
         <w:t>, 119237 (2022).</w:t>
       </w:r>
     </w:p>
     <w:p>
       <w:pPr>
         <w:pStyle w:val="Bibliography"/>
-      </w:pPr>
-      <w:r>
+        <w:rPr>
+          <w:rFonts w:ascii="Arial" w:hAnsi="Arial" w:cs="Arial"/>
+        </w:rPr>
+      </w:pPr>
+      <w:r>
+        <w:rPr>
+          <w:rFonts w:ascii="Arial" w:hAnsi="Arial" w:cs="Arial"/>
+        </w:rPr>
         <w:t xml:space="preserve">38. </w:t>
       </w:r>
       <w:r>
+        <w:rPr>
+          <w:rFonts w:ascii="Arial" w:hAnsi="Arial" w:cs="Arial"/>
+        </w:rPr>
         <w:tab/>
         <w:t xml:space="preserve">H. McBrien, D. Mork, M.-A. Kioumourtzoglou, J. A. Casey, Assessing potential sources of bias in measuring power outage exposure with simulations. </w:t>
       </w:r>
       <w:r>
         <w:rPr>
+          <w:rFonts w:ascii="Arial" w:hAnsi="Arial" w:cs="Arial"/>
           <w:i/>
           <w:iCs/>
         </w:rPr>
         <w:t>Under review at Environmental Health</w:t>
       </w:r>
       <w:r>
+        <w:rPr>
+          <w:rFonts w:ascii="Arial" w:hAnsi="Arial" w:cs="Arial"/>
+        </w:rPr>
         <w:t>.</w:t>
       </w:r>
     </w:p>
     <w:p>
       <w:pPr>
         <w:pStyle w:val="Bibliography"/>
-      </w:pPr>
-      <w:r>
+        <w:rPr>
+          <w:rFonts w:ascii="Arial" w:hAnsi="Arial" w:cs="Arial"/>
+        </w:rPr>
+      </w:pPr>
+      <w:r>
+        <w:rPr>
+          <w:rFonts w:ascii="Arial" w:hAnsi="Arial" w:cs="Arial"/>
+        </w:rPr>
         <w:t xml:space="preserve">39. </w:t>
       </w:r>
       <w:r>
+        <w:rPr>
+          <w:rFonts w:ascii="Arial" w:hAnsi="Arial" w:cs="Arial"/>
+        </w:rPr>
         <w:tab/>
         <w:t xml:space="preserve">A. J. Northrop, N. M. Flores, V. Do, P. E. Sheffield, J. A. Casey, Power outages and pediatric unintentional injury hospitalizations in New York State. </w:t>
       </w:r>
       <w:r>
         <w:rPr>
+          <w:rFonts w:ascii="Arial" w:hAnsi="Arial" w:cs="Arial"/>
           <w:i/>
           <w:iCs/>
         </w:rPr>
         <w:t>Environmental Epidemiology</w:t>
       </w:r>
       <w:r>
+        <w:rPr>
+          <w:rFonts w:ascii="Arial" w:hAnsi="Arial" w:cs="Arial"/>
+        </w:rPr>
         <w:t xml:space="preserve"> </w:t>
       </w:r>
       <w:r>
         <w:rPr>
+          <w:rFonts w:ascii="Arial" w:hAnsi="Arial" w:cs="Arial"/>
           <w:b/>
           <w:bCs/>
         </w:rPr>
         <w:t>8</w:t>
       </w:r>
       <w:r>
+        <w:rPr>
+          <w:rFonts w:ascii="Arial" w:hAnsi="Arial" w:cs="Arial"/>
+        </w:rPr>
         <w:t>, e287 (2024).</w:t>
       </w:r>
     </w:p>
     <w:p>
       <w:pPr>
         <w:pStyle w:val="Bibliography"/>
-      </w:pPr>
-      <w:r>
+        <w:rPr>
+          <w:rFonts w:ascii="Arial" w:hAnsi="Arial" w:cs="Arial"/>
+        </w:rPr>
+      </w:pPr>
+      <w:r>
+        <w:rPr>
+          <w:rFonts w:ascii="Arial" w:hAnsi="Arial" w:cs="Arial"/>
+        </w:rPr>
+        <w:lastRenderedPageBreak/>
         <w:t xml:space="preserve">40. </w:t>
       </w:r>
       <w:r>
+        <w:rPr>
+          <w:rFonts w:ascii="Arial" w:hAnsi="Arial" w:cs="Arial"/>
+        </w:rPr>
         <w:tab/>
         <w:t xml:space="preserve">U.S. Energy Information Administration Electricity Data. </w:t>
       </w:r>
       <w:r>
         <w:rPr>
+          <w:rFonts w:ascii="Arial" w:hAnsi="Arial" w:cs="Arial"/>
           <w:i/>
           <w:iCs/>
         </w:rPr>
         <w:t>U.S. Energy Information Administration Electricity Data</w:t>
       </w:r>
       <w:r>
+        <w:rPr>
+          <w:rFonts w:ascii="Arial" w:hAnsi="Arial" w:cs="Arial"/>
+        </w:rPr>
         <w:t>. Available at: https://www.eia.gov/electricity/data.php [Accessed 3 January 2024].</w:t>
       </w:r>
     </w:p>
     <w:p>
       <w:pPr>
         <w:pStyle w:val="Bibliography"/>
-      </w:pPr>
-      <w:r>
-        <w:lastRenderedPageBreak/>
+        <w:rPr>
+          <w:rFonts w:ascii="Arial" w:hAnsi="Arial" w:cs="Arial"/>
+        </w:rPr>
+      </w:pPr>
+      <w:r>
+        <w:rPr>
+          <w:rFonts w:ascii="Arial" w:hAnsi="Arial" w:cs="Arial"/>
+        </w:rPr>
         <w:t xml:space="preserve">41. </w:t>
       </w:r>
       <w:r>
+        <w:rPr>
+          <w:rFonts w:ascii="Arial" w:hAnsi="Arial" w:cs="Arial"/>
+        </w:rPr>
         <w:tab/>
         <w:t xml:space="preserve">J. Xiao, </w:t>
       </w:r>
       <w:r>
         <w:rPr>
+          <w:rFonts w:ascii="Arial" w:hAnsi="Arial" w:cs="Arial"/>
           <w:i/>
           <w:iCs/>
         </w:rPr>
         <w:t>et al.</w:t>
       </w:r>
       <w:r>
+        <w:rPr>
+          <w:rFonts w:ascii="Arial" w:hAnsi="Arial" w:cs="Arial"/>
+        </w:rPr>
         <w:t xml:space="preserve">, Increased risk of multiple pregnancy complications following large-scale power outages during Hurricane Sandy in New York State. </w:t>
       </w:r>
       <w:r>
         <w:rPr>
+          <w:rFonts w:ascii="Arial" w:hAnsi="Arial" w:cs="Arial"/>
           <w:i/>
           <w:iCs/>
         </w:rPr>
         <w:t>Science of The Total Environment</w:t>
       </w:r>
       <w:r>
+        <w:rPr>
+          <w:rFonts w:ascii="Arial" w:hAnsi="Arial" w:cs="Arial"/>
+        </w:rPr>
         <w:t xml:space="preserve"> </w:t>
       </w:r>
       <w:r>
         <w:rPr>
+          <w:rFonts w:ascii="Arial" w:hAnsi="Arial" w:cs="Arial"/>
           <w:b/>
           <w:bCs/>
         </w:rPr>
         <w:t>770</w:t>
       </w:r>
       <w:r>
+        <w:rPr>
+          <w:rFonts w:ascii="Arial" w:hAnsi="Arial" w:cs="Arial"/>
+        </w:rPr>
         <w:t>, 145359 (2021).</w:t>
       </w:r>
     </w:p>
     <w:p>
       <w:pPr>
         <w:pStyle w:val="Bibliography"/>
-      </w:pPr>
-      <w:r>
+        <w:rPr>
+          <w:rFonts w:ascii="Arial" w:hAnsi="Arial" w:cs="Arial"/>
+        </w:rPr>
+      </w:pPr>
+      <w:r>
+        <w:rPr>
+          <w:rFonts w:ascii="Arial" w:hAnsi="Arial" w:cs="Arial"/>
+        </w:rPr>
         <w:t xml:space="preserve">42. </w:t>
       </w:r>
       <w:r>
+        <w:rPr>
+          <w:rFonts w:ascii="Arial" w:hAnsi="Arial" w:cs="Arial"/>
+        </w:rPr>
         <w:tab/>
         <w:t xml:space="preserve">B. G. Armstrong, A. Gasparrini, A. Tobias, Conditional Poisson models: a flexible alternative to conditional logistic case cross-over analysis. </w:t>
       </w:r>
       <w:r>
         <w:rPr>
+          <w:rFonts w:ascii="Arial" w:hAnsi="Arial" w:cs="Arial"/>
           <w:i/>
           <w:iCs/>
         </w:rPr>
         <w:t>BMC Med Res Methodol</w:t>
       </w:r>
       <w:r>
+        <w:rPr>
+          <w:rFonts w:ascii="Arial" w:hAnsi="Arial" w:cs="Arial"/>
+        </w:rPr>
         <w:t xml:space="preserve"> </w:t>
       </w:r>
       <w:r>
         <w:rPr>
+          <w:rFonts w:ascii="Arial" w:hAnsi="Arial" w:cs="Arial"/>
           <w:b/>
           <w:bCs/>
         </w:rPr>
         <w:t>14</w:t>
       </w:r>
       <w:r>
+        <w:rPr>
+          <w:rFonts w:ascii="Arial" w:hAnsi="Arial" w:cs="Arial"/>
+        </w:rPr>
         <w:t>, 122 (2014).</w:t>
       </w:r>
     </w:p>
     <w:p>
       <w:pPr>
         <w:pStyle w:val="Bibliography"/>
-      </w:pPr>
-      <w:r>
+        <w:rPr>
+          <w:rFonts w:ascii="Arial" w:hAnsi="Arial" w:cs="Arial"/>
+        </w:rPr>
+      </w:pPr>
+      <w:r>
+        <w:rPr>
+          <w:rFonts w:ascii="Arial" w:hAnsi="Arial" w:cs="Arial"/>
+        </w:rPr>
         <w:t xml:space="preserve">43. </w:t>
       </w:r>
       <w:r>
+        <w:rPr>
+          <w:rFonts w:ascii="Arial" w:hAnsi="Arial" w:cs="Arial"/>
+        </w:rPr>
         <w:tab/>
         <w:t xml:space="preserve">C. J. Gronlund, K. P. Sullivan, Y. Kefelegn, L. Cameron, M. S. O’Neill, Climate change and temperature extremes: A review of heat- and cold-related morbidity and mortality concerns of municipalities. </w:t>
       </w:r>
       <w:r>
         <w:rPr>
+          <w:rFonts w:ascii="Arial" w:hAnsi="Arial" w:cs="Arial"/>
           <w:i/>
           <w:iCs/>
         </w:rPr>
         <w:t>Maturitas</w:t>
       </w:r>
       <w:r>
+        <w:rPr>
+          <w:rFonts w:ascii="Arial" w:hAnsi="Arial" w:cs="Arial"/>
+        </w:rPr>
         <w:t xml:space="preserve"> </w:t>
       </w:r>
       <w:r>
         <w:rPr>
+          <w:rFonts w:ascii="Arial" w:hAnsi="Arial" w:cs="Arial"/>
           <w:b/>
           <w:bCs/>
         </w:rPr>
         <w:t>114</w:t>
       </w:r>
       <w:r>
+        <w:rPr>
+          <w:rFonts w:ascii="Arial" w:hAnsi="Arial" w:cs="Arial"/>
+        </w:rPr>
         <w:t>, 54–59 (2018).</w:t>
       </w:r>
     </w:p>
     <w:p>
       <w:pPr>
         <w:pStyle w:val="Bibliography"/>
-      </w:pPr>
-      <w:r>
+        <w:rPr>
+          <w:rFonts w:ascii="Arial" w:hAnsi="Arial" w:cs="Arial"/>
+        </w:rPr>
+      </w:pPr>
+      <w:r>
+        <w:rPr>
+          <w:rFonts w:ascii="Arial" w:hAnsi="Arial" w:cs="Arial"/>
+        </w:rPr>
         <w:t xml:space="preserve">44. </w:t>
       </w:r>
       <w:r>
+        <w:rPr>
+          <w:rFonts w:ascii="Arial" w:hAnsi="Arial" w:cs="Arial"/>
+        </w:rPr>
         <w:tab/>
         <w:t xml:space="preserve">C.-M. Tseng, </w:t>
       </w:r>
       <w:r>
         <w:rPr>
+          <w:rFonts w:ascii="Arial" w:hAnsi="Arial" w:cs="Arial"/>
           <w:i/>
           <w:iCs/>
         </w:rPr>
         <w:t>et al.</w:t>
       </w:r>
       <w:r>
+        <w:rPr>
+          <w:rFonts w:ascii="Arial" w:hAnsi="Arial" w:cs="Arial"/>
+        </w:rPr>
         <w:t xml:space="preserve">, The Effect of Cold Temperature on Increased Exacerbation of Chronic Obstructive Pulmonary Disease: A Nationwide Study. </w:t>
       </w:r>
       <w:r>
         <w:rPr>
+          <w:rFonts w:ascii="Arial" w:hAnsi="Arial" w:cs="Arial"/>
           <w:i/>
           <w:iCs/>
         </w:rPr>
         <w:t>PLoS ONE</w:t>
       </w:r>
       <w:r>
+        <w:rPr>
+          <w:rFonts w:ascii="Arial" w:hAnsi="Arial" w:cs="Arial"/>
+        </w:rPr>
         <w:t xml:space="preserve"> </w:t>
       </w:r>
       <w:r>
         <w:rPr>
+          <w:rFonts w:ascii="Arial" w:hAnsi="Arial" w:cs="Arial"/>
           <w:b/>
           <w:bCs/>
         </w:rPr>
         <w:t>8</w:t>
       </w:r>
       <w:r>
+        <w:rPr>
+          <w:rFonts w:ascii="Arial" w:hAnsi="Arial" w:cs="Arial"/>
+        </w:rPr>
         <w:t>, e57066 (2013).</w:t>
       </w:r>
     </w:p>
     <w:p>
       <w:pPr>
         <w:pStyle w:val="Bibliography"/>
-      </w:pPr>
-      <w:r>
+        <w:rPr>
+          <w:rFonts w:ascii="Arial" w:hAnsi="Arial" w:cs="Arial"/>
+        </w:rPr>
+      </w:pPr>
+      <w:r>
+        <w:rPr>
+          <w:rFonts w:ascii="Arial" w:hAnsi="Arial" w:cs="Arial"/>
+        </w:rPr>
         <w:t xml:space="preserve">45. </w:t>
       </w:r>
       <w:r>
+        <w:rPr>
+          <w:rFonts w:ascii="Arial" w:hAnsi="Arial" w:cs="Arial"/>
+        </w:rPr>
         <w:tab/>
         <w:t xml:space="preserve">B. Alahmad, </w:t>
       </w:r>
       <w:r>
         <w:rPr>
+          <w:rFonts w:ascii="Arial" w:hAnsi="Arial" w:cs="Arial"/>
           <w:i/>
           <w:iCs/>
         </w:rPr>
         <w:t>et al.</w:t>
       </w:r>
       <w:r>
+        <w:rPr>
+          <w:rFonts w:ascii="Arial" w:hAnsi="Arial" w:cs="Arial"/>
+        </w:rPr>
         <w:t xml:space="preserve">, Associations Between Extreme Temperatures and Cardiovascular Cause-Specific Mortality: Results From 27 Countries. </w:t>
       </w:r>
       <w:r>
         <w:rPr>
+          <w:rFonts w:ascii="Arial" w:hAnsi="Arial" w:cs="Arial"/>
           <w:i/>
           <w:iCs/>
         </w:rPr>
         <w:t>Circulation</w:t>
       </w:r>
       <w:r>
+        <w:rPr>
+          <w:rFonts w:ascii="Arial" w:hAnsi="Arial" w:cs="Arial"/>
+        </w:rPr>
         <w:t xml:space="preserve"> </w:t>
       </w:r>
       <w:r>
         <w:rPr>
+          <w:rFonts w:ascii="Arial" w:hAnsi="Arial" w:cs="Arial"/>
           <w:b/>
           <w:bCs/>
         </w:rPr>
         <w:t>147</w:t>
       </w:r>
       <w:r>
+        <w:rPr>
+          <w:rFonts w:ascii="Arial" w:hAnsi="Arial" w:cs="Arial"/>
+        </w:rPr>
         <w:t>, 35–46 (2023).</w:t>
       </w:r>
     </w:p>
     <w:p>
       <w:pPr>
         <w:pStyle w:val="Bibliography"/>
-      </w:pPr>
-      <w:r>
+        <w:rPr>
+          <w:rFonts w:ascii="Arial" w:hAnsi="Arial" w:cs="Arial"/>
+        </w:rPr>
+      </w:pPr>
+      <w:r>
+        <w:rPr>
+          <w:rFonts w:ascii="Arial" w:hAnsi="Arial" w:cs="Arial"/>
+        </w:rPr>
         <w:t xml:space="preserve">46. </w:t>
       </w:r>
       <w:r>
+        <w:rPr>
+          <w:rFonts w:ascii="Arial" w:hAnsi="Arial" w:cs="Arial"/>
+        </w:rPr>
         <w:tab/>
         <w:t xml:space="preserve">J. T. Abatzoglou, Development of gridded surface meteorological data for ecological applications and modelling. </w:t>
       </w:r>
       <w:r>
         <w:rPr>
+          <w:rFonts w:ascii="Arial" w:hAnsi="Arial" w:cs="Arial"/>
           <w:i/>
           <w:iCs/>
         </w:rPr>
         <w:t>Intl Journal of Climatology</w:t>
       </w:r>
       <w:r>
+        <w:rPr>
+          <w:rFonts w:ascii="Arial" w:hAnsi="Arial" w:cs="Arial"/>
+        </w:rPr>
         <w:t xml:space="preserve"> </w:t>
       </w:r>
       <w:r>
         <w:rPr>
+          <w:rFonts w:ascii="Arial" w:hAnsi="Arial" w:cs="Arial"/>
           <w:b/>
           <w:bCs/>
         </w:rPr>
         <w:t>33</w:t>
       </w:r>
       <w:r>
+        <w:rPr>
+          <w:rFonts w:ascii="Arial" w:hAnsi="Arial" w:cs="Arial"/>
+        </w:rPr>
         <w:t>, 121–131 (2013).</w:t>
       </w:r>
     </w:p>
     <w:p>
       <w:pPr>
         <w:pStyle w:val="Bibliography"/>
-      </w:pPr>
-      <w:r>
+        <w:rPr>
+          <w:rFonts w:ascii="Arial" w:hAnsi="Arial" w:cs="Arial"/>
+        </w:rPr>
+      </w:pPr>
+      <w:r>
+        <w:rPr>
+          <w:rFonts w:ascii="Arial" w:hAnsi="Arial" w:cs="Arial"/>
+        </w:rPr>
         <w:t xml:space="preserve">47. </w:t>
       </w:r>
       <w:r>
+        <w:rPr>
+          <w:rFonts w:ascii="Arial" w:hAnsi="Arial" w:cs="Arial"/>
+        </w:rPr>
         <w:tab/>
-        <w:t xml:space="preserve">A. Gasparrini, B. Armstrong, M. G. Kenward, Distributed lag non‐linear models. </w:t>
-      </w:r>
-      <w:r>
-        <w:rPr>
+        <w:t>A. Gasparrini, B. Armstrong, M. G. Kenward, Distributed lag non</w:t>
+      </w:r>
+      <w:r>
+        <w:rPr>
+          <w:rFonts w:ascii="Cambria Math" w:hAnsi="Cambria Math" w:cs="Cambria Math"/>
+        </w:rPr>
+        <w:t>‐</w:t>
+      </w:r>
+      <w:r>
+        <w:rPr>
+          <w:rFonts w:ascii="Arial" w:hAnsi="Arial" w:cs="Arial"/>
+        </w:rPr>
+        <w:t xml:space="preserve">linear models. </w:t>
+      </w:r>
+      <w:r>
+        <w:rPr>
+          <w:rFonts w:ascii="Arial" w:hAnsi="Arial" w:cs="Arial"/>
           <w:i/>
           <w:iCs/>
         </w:rPr>
         <w:t>Statistics in Medicine</w:t>
       </w:r>
       <w:r>
+        <w:rPr>
+          <w:rFonts w:ascii="Arial" w:hAnsi="Arial" w:cs="Arial"/>
+        </w:rPr>
         <w:t xml:space="preserve"> </w:t>
       </w:r>
       <w:r>
         <w:rPr>
+          <w:rFonts w:ascii="Arial" w:hAnsi="Arial" w:cs="Arial"/>
           <w:b/>
           <w:bCs/>
         </w:rPr>
         <w:t>29</w:t>
       </w:r>
       <w:r>
+        <w:rPr>
+          <w:rFonts w:ascii="Arial" w:hAnsi="Arial" w:cs="Arial"/>
+        </w:rPr>
         <w:t>, 2224–2234 (2010).</w:t>
       </w:r>
     </w:p>
     <w:p>
       <w:pPr>
         <w:pStyle w:val="Bibliography"/>
-      </w:pPr>
-      <w:r>
+        <w:rPr>
+          <w:rFonts w:ascii="Arial" w:hAnsi="Arial" w:cs="Arial"/>
+        </w:rPr>
+      </w:pPr>
+      <w:r>
+        <w:rPr>
+          <w:rFonts w:ascii="Arial" w:hAnsi="Arial" w:cs="Arial"/>
+        </w:rPr>
         <w:t xml:space="preserve">48. </w:t>
       </w:r>
       <w:r>
+        <w:rPr>
+          <w:rFonts w:ascii="Arial" w:hAnsi="Arial" w:cs="Arial"/>
+        </w:rPr>
         <w:tab/>
         <w:t>HHS emPOWER program platform. Available at: https://empowerprogram.hhs.gov/ [Accessed 3 January 2024].</w:t>
       </w:r>
@@ -13139,11 +14073,20 @@
     <w:p>
       <w:pPr>
         <w:pStyle w:val="Bibliography"/>
-      </w:pPr>
-      <w:r>
+        <w:rPr>
+          <w:rFonts w:ascii="Arial" w:hAnsi="Arial" w:cs="Arial"/>
+        </w:rPr>
+      </w:pPr>
+      <w:r>
+        <w:rPr>
+          <w:rFonts w:ascii="Arial" w:hAnsi="Arial" w:cs="Arial"/>
+        </w:rPr>
         <w:t xml:space="preserve">49. </w:t>
       </w:r>
       <w:r>
+        <w:rPr>
+          <w:rFonts w:ascii="Arial" w:hAnsi="Arial" w:cs="Arial"/>
+        </w:rPr>
         <w:tab/>
         <w:t>H. Turner, D. Firth, gnm: Generalized Nonlinear Models. https://doi.org/10.32614/CRAN.package.gnm. Deposited 29 June 2005.</w:t>
       </w:r>
@@ -13151,74 +14094,112 @@
     <w:p>
       <w:pPr>
         <w:pStyle w:val="Bibliography"/>
-      </w:pPr>
-      <w:r>
+        <w:rPr>
+          <w:rFonts w:ascii="Arial" w:hAnsi="Arial" w:cs="Arial"/>
+        </w:rPr>
+      </w:pPr>
+      <w:r>
+        <w:rPr>
+          <w:rFonts w:ascii="Arial" w:hAnsi="Arial" w:cs="Arial"/>
+        </w:rPr>
         <w:t xml:space="preserve">50. </w:t>
       </w:r>
       <w:r>
+        <w:rPr>
+          <w:rFonts w:ascii="Arial" w:hAnsi="Arial" w:cs="Arial"/>
+        </w:rPr>
         <w:tab/>
         <w:t xml:space="preserve">W. Wang, J. Yan, Shape-Restricted Regression Splines with R Package splines2. </w:t>
       </w:r>
       <w:r>
         <w:rPr>
+          <w:rFonts w:ascii="Arial" w:hAnsi="Arial" w:cs="Arial"/>
           <w:i/>
           <w:iCs/>
         </w:rPr>
         <w:t>Journal of Data Science</w:t>
       </w:r>
       <w:r>
+        <w:rPr>
+          <w:rFonts w:ascii="Arial" w:hAnsi="Arial" w:cs="Arial"/>
+        </w:rPr>
         <w:t xml:space="preserve"> 498–517 (2021). https://doi.org/10.6339/21-JDS1020.</w:t>
       </w:r>
     </w:p>
     <w:p>
       <w:pPr>
         <w:pStyle w:val="Bibliography"/>
-      </w:pPr>
-      <w:r>
+        <w:rPr>
+          <w:rFonts w:ascii="Arial" w:hAnsi="Arial" w:cs="Arial"/>
+        </w:rPr>
+      </w:pPr>
+      <w:r>
+        <w:rPr>
+          <w:rFonts w:ascii="Arial" w:hAnsi="Arial" w:cs="Arial"/>
+        </w:rPr>
         <w:t xml:space="preserve">51. </w:t>
       </w:r>
       <w:r>
+        <w:rPr>
+          <w:rFonts w:ascii="Arial" w:hAnsi="Arial" w:cs="Arial"/>
+        </w:rPr>
         <w:tab/>
         <w:t xml:space="preserve">A. Gasparrini, Distributed Lag Linear and Non-Linear Models in </w:t>
       </w:r>
       <w:r>
         <w:rPr>
+          <w:rFonts w:ascii="Arial" w:hAnsi="Arial" w:cs="Arial"/>
           <w:i/>
           <w:iCs/>
         </w:rPr>
         <w:t>R</w:t>
       </w:r>
       <w:r>
+        <w:rPr>
+          <w:rFonts w:ascii="Arial" w:hAnsi="Arial" w:cs="Arial"/>
+        </w:rPr>
         <w:t xml:space="preserve"> : The Package </w:t>
       </w:r>
       <w:r>
         <w:rPr>
+          <w:rFonts w:ascii="Arial" w:hAnsi="Arial" w:cs="Arial"/>
           <w:b/>
           <w:bCs/>
         </w:rPr>
         <w:t>dlnm</w:t>
       </w:r>
       <w:r>
+        <w:rPr>
+          <w:rFonts w:ascii="Arial" w:hAnsi="Arial" w:cs="Arial"/>
+        </w:rPr>
         <w:t xml:space="preserve">. </w:t>
       </w:r>
       <w:r>
         <w:rPr>
+          <w:rFonts w:ascii="Arial" w:hAnsi="Arial" w:cs="Arial"/>
           <w:i/>
           <w:iCs/>
         </w:rPr>
         <w:t>J. Stat. Soft.</w:t>
       </w:r>
       <w:r>
+        <w:rPr>
+          <w:rFonts w:ascii="Arial" w:hAnsi="Arial" w:cs="Arial"/>
+        </w:rPr>
         <w:t xml:space="preserve"> </w:t>
       </w:r>
       <w:r>
         <w:rPr>
+          <w:rFonts w:ascii="Arial" w:hAnsi="Arial" w:cs="Arial"/>
           <w:b/>
           <w:bCs/>
         </w:rPr>
         <w:t>43</w:t>
       </w:r>
       <w:r>
+        <w:rPr>
+          <w:rFonts w:ascii="Arial" w:hAnsi="Arial" w:cs="Arial"/>
+        </w:rPr>
         <w:t xml:space="preserve"> (2011).</w:t>
       </w:r>
     </w:p>
@@ -13318,7 +14299,6 @@
           <w:sz w:val="20"/>
           <w:szCs w:val="20"/>
         </w:rPr>
-        <w:lastRenderedPageBreak/>
         <w:t>Figures and Tables</w:t>
       </w:r>
       <w:r>
@@ -13942,6 +14922,7 @@
           <w:sz w:val="20"/>
           <w:szCs w:val="20"/>
         </w:rPr>
+        <w:lastRenderedPageBreak/>
         <w:t>A</w:t>
       </w:r>
       <w:r>
@@ -14068,9 +15049,82 @@
       </w:r>
       <w:r>
         <w:rPr>
+          <w:rFonts w:ascii="Arial" w:hAnsi="Arial" w:cs="Arial"/>
           <w:noProof/>
+          <w:color w:val="000000"/>
+          <w:sz w:val="20"/>
+          <w:szCs w:val="20"/>
         </w:rPr>
         <w:lastRenderedPageBreak/>
+        <w:drawing>
+          <wp:anchor distT="0" distB="0" distL="114300" distR="114300" simplePos="0" relativeHeight="251659263" behindDoc="0" locked="0" layoutInCell="1" allowOverlap="1" wp14:anchorId="6FB7000A" wp14:editId="3DC81DB2">
+            <wp:simplePos x="0" y="0"/>
+            <wp:positionH relativeFrom="column">
+              <wp:posOffset>-338455</wp:posOffset>
+            </wp:positionH>
+            <wp:positionV relativeFrom="paragraph">
+              <wp:posOffset>252095</wp:posOffset>
+            </wp:positionV>
+            <wp:extent cx="6583680" cy="3392170"/>
+            <wp:effectExtent l="0" t="0" r="0" b="0"/>
+            <wp:wrapSquare wrapText="bothSides"/>
+            <wp:docPr id="247509353" name="Picture 5"/>
+            <wp:cNvGraphicFramePr>
+              <a:graphicFrameLocks xmlns:a="http://schemas.openxmlformats.org/drawingml/2006/main" noChangeAspect="1"/>
+            </wp:cNvGraphicFramePr>
+            <a:graphic xmlns:a="http://schemas.openxmlformats.org/drawingml/2006/main">
+              <a:graphicData uri="http://schemas.openxmlformats.org/drawingml/2006/picture">
+                <pic:pic xmlns:pic="http://schemas.openxmlformats.org/drawingml/2006/picture">
+                  <pic:nvPicPr>
+                    <pic:cNvPr id="247509353" name="Picture 247509353"/>
+                    <pic:cNvPicPr/>
+                  </pic:nvPicPr>
+                  <pic:blipFill rotWithShape="1">
+                    <a:blip r:embed="rId14" cstate="print">
+                      <a:extLst>
+                        <a:ext uri="{28A0092B-C50C-407E-A947-70E740481C1C}">
+                          <a14:useLocalDpi xmlns:a14="http://schemas.microsoft.com/office/drawing/2010/main" val="0"/>
+                        </a:ext>
+                      </a:extLst>
+                    </a:blip>
+                    <a:srcRect b="1486"/>
+                    <a:stretch>
+                      <a:fillRect/>
+                    </a:stretch>
+                  </pic:blipFill>
+                  <pic:spPr bwMode="auto">
+                    <a:xfrm>
+                      <a:off x="0" y="0"/>
+                      <a:ext cx="6583680" cy="3392170"/>
+                    </a:xfrm>
+                    <a:prstGeom prst="rect">
+                      <a:avLst/>
+                    </a:prstGeom>
+                    <a:ln>
+                      <a:noFill/>
+                    </a:ln>
+                    <a:extLst>
+                      <a:ext uri="{53640926-AAD7-44D8-BBD7-CCE9431645EC}">
+                        <a14:shadowObscured xmlns:a14="http://schemas.microsoft.com/office/drawing/2010/main"/>
+                      </a:ext>
+                    </a:extLst>
+                  </pic:spPr>
+                </pic:pic>
+              </a:graphicData>
+            </a:graphic>
+            <wp14:sizeRelH relativeFrom="page">
+              <wp14:pctWidth>0</wp14:pctWidth>
+            </wp14:sizeRelH>
+            <wp14:sizeRelV relativeFrom="page">
+              <wp14:pctHeight>0</wp14:pctHeight>
+            </wp14:sizeRelV>
+          </wp:anchor>
+        </w:drawing>
+      </w:r>
+      <w:r>
+        <w:rPr>
+          <w:noProof/>
+        </w:rPr>
         <mc:AlternateContent>
           <mc:Choice Requires="wps">
             <w:drawing>
@@ -14290,7 +15344,7 @@
           <w:noProof/>
         </w:rPr>
         <w:drawing>
-          <wp:anchor distT="0" distB="0" distL="114300" distR="114300" simplePos="0" relativeHeight="251663360" behindDoc="0" locked="0" layoutInCell="1" allowOverlap="1" wp14:anchorId="137C2B11" wp14:editId="043E965B">
+          <wp:anchor distT="0" distB="0" distL="114300" distR="114300" simplePos="0" relativeHeight="251663360" behindDoc="0" locked="0" layoutInCell="1" allowOverlap="1" wp14:anchorId="137C2B11" wp14:editId="4001AD47">
             <wp:simplePos x="0" y="0"/>
             <wp:positionH relativeFrom="column">
               <wp:posOffset>4906010</wp:posOffset>
@@ -14313,7 +15367,7 @@
                     <pic:cNvPicPr/>
                   </pic:nvPicPr>
                   <pic:blipFill>
-                    <a:blip r:embed="rId14" cstate="print">
+                    <a:blip r:embed="rId15" cstate="print">
                       <a:extLst>
                         <a:ext uri="{28A0092B-C50C-407E-A947-70E740481C1C}">
                           <a14:useLocalDpi xmlns:a14="http://schemas.microsoft.com/office/drawing/2010/main" val="0"/>
@@ -14339,70 +15393,6 @@
                         </a:schemeClr>
                       </a:solidFill>
                     </a:ln>
-                  </pic:spPr>
-                </pic:pic>
-              </a:graphicData>
-            </a:graphic>
-            <wp14:sizeRelH relativeFrom="page">
-              <wp14:pctWidth>0</wp14:pctWidth>
-            </wp14:sizeRelH>
-            <wp14:sizeRelV relativeFrom="page">
-              <wp14:pctHeight>0</wp14:pctHeight>
-            </wp14:sizeRelV>
-          </wp:anchor>
-        </w:drawing>
-      </w:r>
-      <w:r>
-        <w:rPr>
-          <w:rFonts w:ascii="Arial" w:hAnsi="Arial" w:cs="Arial"/>
-          <w:noProof/>
-          <w:color w:val="000000"/>
-          <w:sz w:val="20"/>
-          <w:szCs w:val="20"/>
-        </w:rPr>
-        <w:drawing>
-          <wp:anchor distT="0" distB="0" distL="114300" distR="114300" simplePos="0" relativeHeight="251659263" behindDoc="0" locked="0" layoutInCell="1" allowOverlap="1" wp14:anchorId="6FB7000A" wp14:editId="0C97EE12">
-            <wp:simplePos x="0" y="0"/>
-            <wp:positionH relativeFrom="column">
-              <wp:posOffset>-341140</wp:posOffset>
-            </wp:positionH>
-            <wp:positionV relativeFrom="paragraph">
-              <wp:posOffset>250825</wp:posOffset>
-            </wp:positionV>
-            <wp:extent cx="6583680" cy="3443605"/>
-            <wp:effectExtent l="0" t="0" r="0" b="0"/>
-            <wp:wrapSquare wrapText="bothSides"/>
-            <wp:docPr id="247509353" name="Picture 5"/>
-            <wp:cNvGraphicFramePr>
-              <a:graphicFrameLocks xmlns:a="http://schemas.openxmlformats.org/drawingml/2006/main" noChangeAspect="1"/>
-            </wp:cNvGraphicFramePr>
-            <a:graphic xmlns:a="http://schemas.openxmlformats.org/drawingml/2006/main">
-              <a:graphicData uri="http://schemas.openxmlformats.org/drawingml/2006/picture">
-                <pic:pic xmlns:pic="http://schemas.openxmlformats.org/drawingml/2006/picture">
-                  <pic:nvPicPr>
-                    <pic:cNvPr id="247509353" name="Picture 247509353"/>
-                    <pic:cNvPicPr/>
-                  </pic:nvPicPr>
-                  <pic:blipFill>
-                    <a:blip r:embed="rId15" cstate="print">
-                      <a:extLst>
-                        <a:ext uri="{28A0092B-C50C-407E-A947-70E740481C1C}">
-                          <a14:useLocalDpi xmlns:a14="http://schemas.microsoft.com/office/drawing/2010/main" val="0"/>
-                        </a:ext>
-                      </a:extLst>
-                    </a:blip>
-                    <a:stretch>
-                      <a:fillRect/>
-                    </a:stretch>
-                  </pic:blipFill>
-                  <pic:spPr>
-                    <a:xfrm>
-                      <a:off x="0" y="0"/>
-                      <a:ext cx="6583680" cy="3443605"/>
-                    </a:xfrm>
-                    <a:prstGeom prst="rect">
-                      <a:avLst/>
-                    </a:prstGeom>
                   </pic:spPr>
                 </pic:pic>
               </a:graphicData>
@@ -15183,7 +16173,18 @@
                 <w:sz w:val="20"/>
                 <w:szCs w:val="20"/>
               </w:rPr>
-              <w:t>1% of county customers</w:t>
+              <w:t xml:space="preserve">1% of county </w:t>
+            </w:r>
+            <w:proofErr w:type="spellStart"/>
+            <w:r>
+              <w:rPr>
+                <w:rFonts w:ascii="Arial" w:hAnsi="Arial" w:cs="Arial"/>
+                <w:b/>
+                <w:bCs/>
+                <w:sz w:val="20"/>
+                <w:szCs w:val="20"/>
+              </w:rPr>
+              <w:t>customers</w:t>
             </w:r>
             <w:r>
               <w:rPr>
@@ -15196,6 +16197,7 @@
               </w:rPr>
               <w:t>a</w:t>
             </w:r>
+            <w:proofErr w:type="spellEnd"/>
           </w:p>
         </w:tc>
       </w:tr>
@@ -16704,6 +17706,7 @@
         </w:rPr>
         <w:t xml:space="preserve"> </w:t>
       </w:r>
+      <w:proofErr w:type="gramStart"/>
       <w:r>
         <w:rPr>
           <w:rFonts w:ascii="Arial" w:hAnsi="Arial" w:cs="Arial"/>
@@ -16722,6 +17725,7 @@
         </w:rPr>
         <w:t>{</w:t>
       </w:r>
+      <w:proofErr w:type="gramEnd"/>
       <w:r>
         <w:rPr>
           <w:rFonts w:ascii="Arial" w:hAnsi="Arial" w:cs="Arial"/>

</xml_diff>